<commit_message>
add report for lab2 && update readme
</commit_message>
<xml_diff>
--- a/report/ЯП_1_лаба_Р4119_Суровикин.docx
+++ b/report/ЯП_1_лаба_Р4119_Суровикин.docx
@@ -22,7 +22,9 @@
         <w:rPr>
           <w:rFonts w:ascii="Times New Roman" w:cs="Times New Roman" w:eastAsia="Times New Roman" w:hAnsi="Times New Roman"/>
           <w:b w:val="0"/>
+          <w:bCs w:val="0"/>
           <w:i w:val="0"/>
+          <w:iCs w:val="0"/>
           <w:smallCaps w:val="0"/>
           <w:strike w:val="0"/>
           <w:color w:val="000000"/>
@@ -37,7 +39,9 @@
         <w:rPr>
           <w:rFonts w:ascii="Times New Roman" w:cs="Times New Roman" w:eastAsia="Times New Roman" w:hAnsi="Times New Roman"/>
           <w:b w:val="0"/>
+          <w:bCs w:val="0"/>
           <w:i w:val="0"/>
+          <w:iCs w:val="0"/>
           <w:smallCaps w:val="0"/>
           <w:strike w:val="0"/>
           <w:color w:val="000000"/>
@@ -71,7 +75,9 @@
         <w:rPr>
           <w:rFonts w:ascii="Times New Roman" w:cs="Times New Roman" w:eastAsia="Times New Roman" w:hAnsi="Times New Roman"/>
           <w:b w:val="0"/>
+          <w:bCs w:val="0"/>
           <w:i w:val="0"/>
+          <w:iCs w:val="0"/>
           <w:smallCaps w:val="0"/>
           <w:strike w:val="0"/>
           <w:color w:val="000000"/>
@@ -86,7 +92,9 @@
         <w:rPr>
           <w:rFonts w:ascii="Times New Roman" w:cs="Times New Roman" w:eastAsia="Times New Roman" w:hAnsi="Times New Roman"/>
           <w:b w:val="0"/>
+          <w:bCs w:val="0"/>
           <w:i w:val="0"/>
+          <w:iCs w:val="0"/>
           <w:smallCaps w:val="0"/>
           <w:strike w:val="0"/>
           <w:color w:val="000000"/>
@@ -120,7 +128,9 @@
         <w:rPr>
           <w:rFonts w:ascii="Times New Roman" w:cs="Times New Roman" w:eastAsia="Times New Roman" w:hAnsi="Times New Roman"/>
           <w:b w:val="0"/>
+          <w:bCs w:val="0"/>
           <w:i w:val="0"/>
+          <w:iCs w:val="0"/>
           <w:smallCaps w:val="0"/>
           <w:strike w:val="0"/>
           <w:color w:val="000000"/>
@@ -135,7 +145,9 @@
         <w:rPr>
           <w:rFonts w:ascii="Times New Roman" w:cs="Times New Roman" w:eastAsia="Times New Roman" w:hAnsi="Times New Roman"/>
           <w:b w:val="0"/>
+          <w:bCs w:val="0"/>
           <w:i w:val="0"/>
+          <w:iCs w:val="0"/>
           <w:smallCaps w:val="0"/>
           <w:strike w:val="0"/>
           <w:color w:val="000000"/>
@@ -169,7 +181,9 @@
         <w:rPr>
           <w:rFonts w:ascii="Times New Roman" w:cs="Times New Roman" w:eastAsia="Times New Roman" w:hAnsi="Times New Roman"/>
           <w:b w:val="0"/>
+          <w:bCs w:val="0"/>
           <w:i w:val="0"/>
+          <w:iCs w:val="0"/>
           <w:smallCaps w:val="0"/>
           <w:strike w:val="0"/>
           <w:color w:val="000000"/>
@@ -206,7 +220,9 @@
         <w:rPr>
           <w:rFonts w:ascii="Times New Roman" w:cs="Times New Roman" w:eastAsia="Times New Roman" w:hAnsi="Times New Roman"/>
           <w:b w:val="0"/>
+          <w:bCs w:val="0"/>
           <w:i w:val="0"/>
+          <w:iCs w:val="0"/>
           <w:smallCaps w:val="0"/>
           <w:strike w:val="0"/>
           <w:color w:val="000000"/>
@@ -243,7 +259,9 @@
         <w:rPr>
           <w:rFonts w:ascii="Times New Roman" w:cs="Times New Roman" w:eastAsia="Times New Roman" w:hAnsi="Times New Roman"/>
           <w:b w:val="0"/>
+          <w:bCs w:val="0"/>
           <w:i w:val="0"/>
+          <w:iCs w:val="0"/>
           <w:smallCaps w:val="0"/>
           <w:strike w:val="0"/>
           <w:color w:val="000000"/>
@@ -280,7 +298,9 @@
         <w:rPr>
           <w:rFonts w:ascii="Times New Roman" w:cs="Times New Roman" w:eastAsia="Times New Roman" w:hAnsi="Times New Roman"/>
           <w:b w:val="0"/>
+          <w:bCs w:val="0"/>
           <w:i w:val="0"/>
+          <w:iCs w:val="0"/>
           <w:smallCaps w:val="0"/>
           <w:strike w:val="0"/>
           <w:color w:val="000000"/>
@@ -317,7 +337,9 @@
         <w:rPr>
           <w:rFonts w:ascii="Times New Roman" w:cs="Times New Roman" w:eastAsia="Times New Roman" w:hAnsi="Times New Roman"/>
           <w:b w:val="0"/>
+          <w:bCs w:val="0"/>
           <w:i w:val="0"/>
+          <w:iCs w:val="0"/>
           <w:smallCaps w:val="0"/>
           <w:strike w:val="0"/>
           <w:color w:val="000000"/>
@@ -393,7 +415,9 @@
         <w:rPr>
           <w:rFonts w:ascii="Times New Roman" w:cs="Times New Roman" w:eastAsia="Times New Roman" w:hAnsi="Times New Roman"/>
           <w:b w:val="0"/>
+          <w:bCs w:val="0"/>
           <w:i w:val="0"/>
+          <w:iCs w:val="0"/>
           <w:smallCaps w:val="0"/>
           <w:strike w:val="0"/>
           <w:color w:val="000000"/>
@@ -430,7 +454,9 @@
         <w:rPr>
           <w:rFonts w:ascii="Times New Roman" w:cs="Times New Roman" w:eastAsia="Times New Roman" w:hAnsi="Times New Roman"/>
           <w:b w:val="0"/>
+          <w:bCs w:val="0"/>
           <w:i w:val="0"/>
+          <w:iCs w:val="0"/>
           <w:smallCaps w:val="0"/>
           <w:strike w:val="0"/>
           <w:color w:val="000000"/>
@@ -467,7 +493,9 @@
         <w:rPr>
           <w:rFonts w:ascii="Times New Roman" w:cs="Times New Roman" w:eastAsia="Times New Roman" w:hAnsi="Times New Roman"/>
           <w:b w:val="0"/>
+          <w:bCs w:val="0"/>
           <w:i w:val="0"/>
+          <w:iCs w:val="0"/>
           <w:smallCaps w:val="0"/>
           <w:strike w:val="0"/>
           <w:color w:val="000000"/>
@@ -504,7 +532,9 @@
         <w:rPr>
           <w:rFonts w:ascii="Times New Roman" w:cs="Times New Roman" w:eastAsia="Times New Roman" w:hAnsi="Times New Roman"/>
           <w:b w:val="0"/>
+          <w:bCs w:val="0"/>
           <w:i w:val="0"/>
+          <w:iCs w:val="0"/>
           <w:smallCaps w:val="0"/>
           <w:strike w:val="0"/>
           <w:color w:val="000000"/>
@@ -577,7 +607,9 @@
               <w:rPr>
                 <w:rFonts w:ascii="Times New Roman" w:cs="Times New Roman" w:eastAsia="Times New Roman" w:hAnsi="Times New Roman"/>
                 <w:b w:val="0"/>
+                <w:bCs w:val="0"/>
                 <w:i w:val="0"/>
+                <w:iCs w:val="0"/>
                 <w:smallCaps w:val="0"/>
                 <w:strike w:val="0"/>
                 <w:color w:val="000000"/>
@@ -592,7 +624,9 @@
               <w:rPr>
                 <w:rFonts w:ascii="Times New Roman" w:cs="Times New Roman" w:eastAsia="Times New Roman" w:hAnsi="Times New Roman"/>
                 <w:b w:val="0"/>
+                <w:bCs w:val="0"/>
                 <w:i w:val="0"/>
+                <w:iCs w:val="0"/>
                 <w:smallCaps w:val="0"/>
                 <w:strike w:val="0"/>
                 <w:color w:val="000000"/>
@@ -629,7 +663,9 @@
               <w:rPr>
                 <w:rFonts w:ascii="Times New Roman" w:cs="Times New Roman" w:eastAsia="Times New Roman" w:hAnsi="Times New Roman"/>
                 <w:b w:val="0"/>
+                <w:bCs w:val="0"/>
                 <w:i w:val="0"/>
+                <w:iCs w:val="0"/>
                 <w:smallCaps w:val="0"/>
                 <w:strike w:val="0"/>
                 <w:color w:val="000000"/>
@@ -644,7 +680,9 @@
               <w:rPr>
                 <w:rFonts w:ascii="Times New Roman" w:cs="Times New Roman" w:eastAsia="Times New Roman" w:hAnsi="Times New Roman"/>
                 <w:b w:val="0"/>
+                <w:bCs w:val="0"/>
                 <w:i w:val="0"/>
+                <w:iCs w:val="0"/>
                 <w:smallCaps w:val="0"/>
                 <w:strike w:val="0"/>
                 <w:color w:val="000000"/>
@@ -681,7 +719,9 @@
               <w:rPr>
                 <w:rFonts w:ascii="Times New Roman" w:cs="Times New Roman" w:eastAsia="Times New Roman" w:hAnsi="Times New Roman"/>
                 <w:b w:val="0"/>
+                <w:bCs w:val="0"/>
                 <w:i w:val="0"/>
+                <w:iCs w:val="0"/>
                 <w:smallCaps w:val="0"/>
                 <w:strike w:val="0"/>
                 <w:color w:val="000000"/>
@@ -736,7 +776,9 @@
               <w:rPr>
                 <w:rFonts w:ascii="Times New Roman" w:cs="Times New Roman" w:eastAsia="Times New Roman" w:hAnsi="Times New Roman"/>
                 <w:b w:val="0"/>
+                <w:bCs w:val="0"/>
                 <w:i w:val="0"/>
+                <w:iCs w:val="0"/>
                 <w:smallCaps w:val="0"/>
                 <w:strike w:val="0"/>
                 <w:color w:val="000000"/>
@@ -776,7 +818,9 @@
               <w:rPr>
                 <w:rFonts w:ascii="Times New Roman" w:cs="Times New Roman" w:eastAsia="Times New Roman" w:hAnsi="Times New Roman"/>
                 <w:b w:val="0"/>
+                <w:bCs w:val="0"/>
                 <w:i w:val="0"/>
+                <w:iCs w:val="0"/>
                 <w:smallCaps w:val="0"/>
                 <w:strike w:val="0"/>
                 <w:color w:val="000000"/>
@@ -791,7 +835,9 @@
               <w:rPr>
                 <w:rFonts w:ascii="Times New Roman" w:cs="Times New Roman" w:eastAsia="Times New Roman" w:hAnsi="Times New Roman"/>
                 <w:b w:val="0"/>
+                <w:bCs w:val="0"/>
                 <w:i w:val="0"/>
+                <w:iCs w:val="0"/>
                 <w:smallCaps w:val="0"/>
                 <w:strike w:val="0"/>
                 <w:color w:val="000000"/>
@@ -828,7 +874,9 @@
               <w:rPr>
                 <w:rFonts w:ascii="Times New Roman" w:cs="Times New Roman" w:eastAsia="Times New Roman" w:hAnsi="Times New Roman"/>
                 <w:b w:val="0"/>
+                <w:bCs w:val="0"/>
                 <w:i w:val="0"/>
+                <w:iCs w:val="0"/>
                 <w:smallCaps w:val="0"/>
                 <w:strike w:val="0"/>
                 <w:color w:val="000000"/>
@@ -873,7 +921,9 @@
         <w:rPr>
           <w:rFonts w:ascii="Times New Roman" w:cs="Times New Roman" w:eastAsia="Times New Roman" w:hAnsi="Times New Roman"/>
           <w:b w:val="0"/>
+          <w:bCs w:val="0"/>
           <w:i w:val="0"/>
+          <w:iCs w:val="0"/>
           <w:smallCaps w:val="0"/>
           <w:strike w:val="0"/>
           <w:color w:val="000000"/>
@@ -946,7 +996,9 @@
               <w:rPr>
                 <w:rFonts w:ascii="Times New Roman" w:cs="Times New Roman" w:eastAsia="Times New Roman" w:hAnsi="Times New Roman"/>
                 <w:b w:val="0"/>
+                <w:bCs w:val="0"/>
                 <w:i w:val="0"/>
+                <w:iCs w:val="0"/>
                 <w:smallCaps w:val="0"/>
                 <w:strike w:val="0"/>
                 <w:color w:val="000000"/>
@@ -961,7 +1013,9 @@
               <w:rPr>
                 <w:rFonts w:ascii="Times New Roman" w:cs="Times New Roman" w:eastAsia="Times New Roman" w:hAnsi="Times New Roman"/>
                 <w:b w:val="0"/>
+                <w:bCs w:val="0"/>
                 <w:i w:val="0"/>
+                <w:iCs w:val="0"/>
                 <w:smallCaps w:val="0"/>
                 <w:strike w:val="0"/>
                 <w:color w:val="000000"/>
@@ -998,7 +1052,9 @@
               <w:rPr>
                 <w:rFonts w:ascii="Times New Roman" w:cs="Times New Roman" w:eastAsia="Times New Roman" w:hAnsi="Times New Roman"/>
                 <w:b w:val="0"/>
+                <w:bCs w:val="0"/>
                 <w:i w:val="0"/>
+                <w:iCs w:val="0"/>
                 <w:smallCaps w:val="0"/>
                 <w:strike w:val="0"/>
                 <w:color w:val="000000"/>
@@ -1013,7 +1069,9 @@
               <w:rPr>
                 <w:rFonts w:ascii="Times New Roman" w:cs="Times New Roman" w:eastAsia="Times New Roman" w:hAnsi="Times New Roman"/>
                 <w:b w:val="0"/>
+                <w:bCs w:val="0"/>
                 <w:i w:val="0"/>
+                <w:iCs w:val="0"/>
                 <w:smallCaps w:val="0"/>
                 <w:strike w:val="0"/>
                 <w:color w:val="000000"/>
@@ -1050,7 +1108,9 @@
               <w:rPr>
                 <w:rFonts w:ascii="Times New Roman" w:cs="Times New Roman" w:eastAsia="Times New Roman" w:hAnsi="Times New Roman"/>
                 <w:b w:val="0"/>
+                <w:bCs w:val="0"/>
                 <w:i w:val="0"/>
+                <w:iCs w:val="0"/>
                 <w:smallCaps w:val="0"/>
                 <w:strike w:val="0"/>
                 <w:color w:val="000000"/>
@@ -1065,7 +1125,9 @@
               <w:rPr>
                 <w:rFonts w:ascii="Times New Roman" w:cs="Times New Roman" w:eastAsia="Times New Roman" w:hAnsi="Times New Roman"/>
                 <w:b w:val="0"/>
+                <w:bCs w:val="0"/>
                 <w:i w:val="0"/>
+                <w:iCs w:val="0"/>
                 <w:smallCaps w:val="0"/>
                 <w:strike w:val="0"/>
                 <w:color w:val="000000"/>
@@ -1108,7 +1170,9 @@
               <w:rPr>
                 <w:rFonts w:ascii="Times New Roman" w:cs="Times New Roman" w:eastAsia="Times New Roman" w:hAnsi="Times New Roman"/>
                 <w:b w:val="0"/>
+                <w:bCs w:val="0"/>
                 <w:i w:val="0"/>
+                <w:iCs w:val="0"/>
                 <w:smallCaps w:val="0"/>
                 <w:strike w:val="0"/>
                 <w:color w:val="000000"/>
@@ -1148,7 +1212,9 @@
               <w:rPr>
                 <w:rFonts w:ascii="Times New Roman" w:cs="Times New Roman" w:eastAsia="Times New Roman" w:hAnsi="Times New Roman"/>
                 <w:b w:val="0"/>
+                <w:bCs w:val="0"/>
                 <w:i w:val="0"/>
+                <w:iCs w:val="0"/>
                 <w:smallCaps w:val="0"/>
                 <w:strike w:val="0"/>
                 <w:color w:val="000000"/>
@@ -1163,7 +1229,9 @@
               <w:rPr>
                 <w:rFonts w:ascii="Times New Roman" w:cs="Times New Roman" w:eastAsia="Times New Roman" w:hAnsi="Times New Roman"/>
                 <w:b w:val="0"/>
+                <w:bCs w:val="0"/>
                 <w:i w:val="0"/>
+                <w:iCs w:val="0"/>
                 <w:smallCaps w:val="0"/>
                 <w:strike w:val="0"/>
                 <w:color w:val="000000"/>
@@ -1200,7 +1268,9 @@
               <w:rPr>
                 <w:rFonts w:ascii="Times New Roman" w:cs="Times New Roman" w:eastAsia="Times New Roman" w:hAnsi="Times New Roman"/>
                 <w:b w:val="0"/>
+                <w:bCs w:val="0"/>
                 <w:i w:val="0"/>
+                <w:iCs w:val="0"/>
                 <w:smallCaps w:val="0"/>
                 <w:strike w:val="0"/>
                 <w:color w:val="000000"/>
@@ -1245,7 +1315,9 @@
         <w:rPr>
           <w:rFonts w:ascii="Times New Roman" w:cs="Times New Roman" w:eastAsia="Times New Roman" w:hAnsi="Times New Roman"/>
           <w:b w:val="0"/>
+          <w:bCs w:val="0"/>
           <w:i w:val="0"/>
+          <w:iCs w:val="0"/>
           <w:smallCaps w:val="0"/>
           <w:strike w:val="0"/>
           <w:color w:val="000000"/>
@@ -1282,7 +1354,9 @@
         <w:rPr>
           <w:rFonts w:ascii="Times New Roman" w:cs="Times New Roman" w:eastAsia="Times New Roman" w:hAnsi="Times New Roman"/>
           <w:b w:val="0"/>
+          <w:bCs w:val="0"/>
           <w:i w:val="0"/>
+          <w:iCs w:val="0"/>
           <w:smallCaps w:val="0"/>
           <w:strike w:val="0"/>
           <w:color w:val="000000"/>
@@ -1319,7 +1393,9 @@
         <w:rPr>
           <w:rFonts w:ascii="Times New Roman" w:cs="Times New Roman" w:eastAsia="Times New Roman" w:hAnsi="Times New Roman"/>
           <w:b w:val="0"/>
+          <w:bCs w:val="0"/>
           <w:i w:val="0"/>
+          <w:iCs w:val="0"/>
           <w:smallCaps w:val="0"/>
           <w:strike w:val="0"/>
           <w:color w:val="000000"/>
@@ -1334,7 +1410,9 @@
         <w:rPr>
           <w:rFonts w:ascii="Times New Roman" w:cs="Times New Roman" w:eastAsia="Times New Roman" w:hAnsi="Times New Roman"/>
           <w:b w:val="0"/>
+          <w:bCs w:val="0"/>
           <w:i w:val="0"/>
+          <w:iCs w:val="0"/>
           <w:smallCaps w:val="0"/>
           <w:strike w:val="0"/>
           <w:color w:val="000000"/>
@@ -1364,7 +1442,9 @@
         <w:rPr>
           <w:rFonts w:ascii="Times New Roman" w:cs="Times New Roman" w:eastAsia="Times New Roman" w:hAnsi="Times New Roman"/>
           <w:b w:val="0"/>
+          <w:bCs w:val="0"/>
           <w:i w:val="0"/>
+          <w:iCs w:val="0"/>
           <w:smallCaps w:val="0"/>
           <w:strike w:val="0"/>
           <w:color w:val="000000"/>
@@ -1388,7 +1468,9 @@
         <w:rPr>
           <w:rFonts w:ascii="Times New Roman" w:cs="Times New Roman" w:eastAsia="Times New Roman" w:hAnsi="Times New Roman"/>
           <w:b w:val="0"/>
+          <w:bCs w:val="0"/>
           <w:i w:val="0"/>
+          <w:iCs w:val="0"/>
           <w:smallCaps w:val="0"/>
           <w:strike w:val="0"/>
           <w:color w:val="000000"/>
@@ -1422,7 +1504,9 @@
         <w:rPr>
           <w:rFonts w:ascii="Times New Roman" w:cs="Times New Roman" w:eastAsia="Times New Roman" w:hAnsi="Times New Roman"/>
           <w:b w:val="0"/>
+          <w:bCs w:val="0"/>
           <w:i w:val="0"/>
+          <w:iCs w:val="0"/>
           <w:smallCaps w:val="0"/>
           <w:strike w:val="0"/>
           <w:color w:val="000000"/>
@@ -1437,7 +1521,9 @@
         <w:rPr>
           <w:rFonts w:ascii="Times New Roman" w:cs="Times New Roman" w:eastAsia="Times New Roman" w:hAnsi="Times New Roman"/>
           <w:b w:val="0"/>
+          <w:bCs w:val="0"/>
           <w:i w:val="0"/>
+          <w:iCs w:val="0"/>
           <w:smallCaps w:val="0"/>
           <w:strike w:val="0"/>
           <w:color w:val="000000"/>
@@ -1471,7 +1557,9 @@
         <w:rPr>
           <w:rFonts w:ascii="Times New Roman" w:cs="Times New Roman" w:eastAsia="Times New Roman" w:hAnsi="Times New Roman"/>
           <w:b w:val="0"/>
+          <w:bCs w:val="0"/>
           <w:i w:val="0"/>
+          <w:iCs w:val="0"/>
           <w:smallCaps w:val="0"/>
           <w:strike w:val="0"/>
           <w:color w:val="000000"/>
@@ -1486,7 +1574,9 @@
         <w:rPr>
           <w:rFonts w:ascii="Times New Roman" w:cs="Times New Roman" w:eastAsia="Times New Roman" w:hAnsi="Times New Roman"/>
           <w:b w:val="0"/>
+          <w:bCs w:val="0"/>
           <w:i w:val="0"/>
+          <w:iCs w:val="0"/>
           <w:smallCaps w:val="0"/>
           <w:strike w:val="0"/>
           <w:color w:val="000000"/>
@@ -1520,7 +1610,9 @@
         <w:rPr>
           <w:rFonts w:ascii="Times New Roman" w:cs="Times New Roman" w:eastAsia="Times New Roman" w:hAnsi="Times New Roman"/>
           <w:b w:val="1"/>
+          <w:bCs w:val="1"/>
           <w:i w:val="0"/>
+          <w:iCs w:val="0"/>
           <w:smallCaps w:val="0"/>
           <w:strike w:val="0"/>
           <w:color w:val="000000"/>
@@ -1535,7 +1627,9 @@
         <w:rPr>
           <w:rFonts w:ascii="Times New Roman" w:cs="Times New Roman" w:eastAsia="Times New Roman" w:hAnsi="Times New Roman"/>
           <w:b w:val="1"/>
+          <w:bCs w:val="1"/>
           <w:i w:val="0"/>
+          <w:iCs w:val="0"/>
           <w:smallCaps w:val="0"/>
           <w:strike w:val="0"/>
           <w:color w:val="000000"/>
@@ -1551,7 +1645,7 @@
     </w:p>
     <w:sdt>
       <w:sdtPr>
-        <w:id w:val="607283685"/>
+        <w:id w:val="1163363337"/>
         <w:docPartObj>
           <w:docPartGallery w:val="Table of Contents"/>
           <w:docPartUnique w:val="1"/>
@@ -1560,34 +1654,23 @@
       <w:sdtContent>
         <w:p>
           <w:pPr>
-            <w:keepNext w:val="1"/>
-            <w:keepLines w:val="0"/>
-            <w:pageBreakBefore w:val="0"/>
-            <w:widowControl w:val="1"/>
-            <w:pBdr>
-              <w:top w:space="0" w:sz="0" w:val="nil"/>
-              <w:left w:space="0" w:sz="0" w:val="nil"/>
-              <w:bottom w:space="0" w:sz="0" w:val="nil"/>
-              <w:right w:space="0" w:sz="0" w:val="nil"/>
-              <w:between w:space="0" w:sz="0" w:val="nil"/>
-            </w:pBdr>
-            <w:shd w:fill="auto" w:val="clear"/>
+            <w:widowControl w:val="0"/>
             <w:tabs>
-              <w:tab w:val="right" w:leader="none" w:pos="9638"/>
-              <w:tab w:val="left" w:leader="none" w:pos="1440"/>
+              <w:tab w:val="right" w:leader="none" w:pos="12000"/>
             </w:tabs>
-            <w:spacing w:after="120" w:before="240" w:line="360" w:lineRule="auto"/>
-            <w:ind w:left="0" w:right="0" w:firstLine="709"/>
-            <w:jc w:val="both"/>
+            <w:spacing w:after="0" w:before="60" w:line="360" w:lineRule="auto"/>
+            <w:ind w:firstLine="0"/>
+            <w:jc w:val="left"/>
             <w:rPr>
-              <w:rFonts w:ascii="Calibri" w:cs="Calibri" w:eastAsia="Calibri" w:hAnsi="Calibri"/>
-              <w:b w:val="0"/>
+              <w:b w:val="1"/>
+              <w:bCs w:val="1"/>
               <w:i w:val="0"/>
+              <w:iCs w:val="0"/>
               <w:smallCaps w:val="0"/>
               <w:strike w:val="0"/>
               <w:color w:val="000000"/>
-              <w:sz w:val="24"/>
-              <w:szCs w:val="24"/>
+              <w:sz w:val="32"/>
+              <w:szCs w:val="32"/>
               <w:u w:val="none"/>
               <w:shd w:fill="auto" w:val="clear"/>
               <w:vertAlign w:val="baseline"/>
@@ -1601,9 +1684,10 @@
           <w:hyperlink w:anchor="_dkodo8nz6565">
             <w:r>
               <w:rPr>
-                <w:rFonts w:ascii="Liberation Sans" w:cs="Liberation Sans" w:eastAsia="Liberation Sans" w:hAnsi="Liberation Sans"/>
                 <w:b w:val="1"/>
+                <w:bCs w:val="1"/>
                 <w:i w:val="0"/>
+                <w:iCs w:val="0"/>
                 <w:smallCaps w:val="0"/>
                 <w:strike w:val="0"/>
                 <w:color w:val="000000"/>
@@ -1614,55 +1698,11 @@
                 <w:vertAlign w:val="baseline"/>
                 <w:rtl w:val="0"/>
               </w:rPr>
-              <w:t xml:space="preserve">1.</w:t>
+              <w:t xml:space="preserve">1. Цель работы</w:t>
+              <w:tab/>
+              <w:t xml:space="preserve">2</w:t>
             </w:r>
           </w:hyperlink>
-          <w:hyperlink w:anchor="_dkodo8nz6565">
-            <w:r>
-              <w:rPr>
-                <w:rFonts w:ascii="Calibri" w:cs="Calibri" w:eastAsia="Calibri" w:hAnsi="Calibri"/>
-                <w:b w:val="0"/>
-                <w:i w:val="0"/>
-                <w:smallCaps w:val="0"/>
-                <w:strike w:val="0"/>
-                <w:color w:val="000000"/>
-                <w:sz w:val="24"/>
-                <w:szCs w:val="24"/>
-                <w:u w:val="none"/>
-                <w:shd w:fill="auto" w:val="clear"/>
-                <w:vertAlign w:val="baseline"/>
-                <w:rtl w:val="0"/>
-              </w:rPr>
-              <w:tab/>
-            </w:r>
-          </w:hyperlink>
-          <w:r>
-            <w:fldChar w:fldCharType="begin"/>
-            <w:instrText xml:space="preserve"> PAGEREF _dkodo8nz6565 \h </w:instrText>
-            <w:fldChar w:fldCharType="separate"/>
-          </w:r>
-          <w:r>
-            <w:rPr>
-              <w:rFonts w:ascii="Liberation Sans" w:cs="Liberation Sans" w:eastAsia="Liberation Sans" w:hAnsi="Liberation Sans"/>
-              <w:b w:val="1"/>
-              <w:i w:val="0"/>
-              <w:smallCaps w:val="0"/>
-              <w:strike w:val="0"/>
-              <w:color w:val="000000"/>
-              <w:sz w:val="32"/>
-              <w:szCs w:val="32"/>
-              <w:u w:val="none"/>
-              <w:shd w:fill="auto" w:val="clear"/>
-              <w:vertAlign w:val="baseline"/>
-              <w:rtl w:val="0"/>
-            </w:rPr>
-            <w:t xml:space="preserve">Цель работы</w:t>
-            <w:tab/>
-            <w:t xml:space="preserve">2</w:t>
-          </w:r>
-          <w:r>
-            <w:fldChar w:fldCharType="end"/>
-          </w:r>
           <w:r>
             <w:rPr>
               <w:rtl w:val="0"/>
@@ -1671,664 +1711,18 @@
         </w:p>
         <w:p>
           <w:pPr>
-            <w:keepNext w:val="1"/>
-            <w:keepLines w:val="0"/>
-            <w:pageBreakBefore w:val="0"/>
-            <w:widowControl w:val="1"/>
-            <w:pBdr>
-              <w:top w:space="0" w:sz="0" w:val="nil"/>
-              <w:left w:space="0" w:sz="0" w:val="nil"/>
-              <w:bottom w:space="0" w:sz="0" w:val="nil"/>
-              <w:right w:space="0" w:sz="0" w:val="nil"/>
-              <w:between w:space="0" w:sz="0" w:val="nil"/>
-            </w:pBdr>
-            <w:shd w:fill="auto" w:val="clear"/>
+            <w:widowControl w:val="0"/>
             <w:tabs>
-              <w:tab w:val="right" w:leader="none" w:pos="9638"/>
-              <w:tab w:val="left" w:leader="none" w:pos="1440"/>
+              <w:tab w:val="right" w:leader="none" w:pos="12000"/>
             </w:tabs>
-            <w:spacing w:after="120" w:before="240" w:line="360" w:lineRule="auto"/>
-            <w:ind w:left="0" w:right="0" w:firstLine="709"/>
-            <w:jc w:val="both"/>
+            <w:spacing w:after="0" w:before="60" w:line="360" w:lineRule="auto"/>
+            <w:ind w:firstLine="0"/>
+            <w:jc w:val="left"/>
             <w:rPr>
-              <w:rFonts w:ascii="Calibri" w:cs="Calibri" w:eastAsia="Calibri" w:hAnsi="Calibri"/>
-              <w:b w:val="0"/>
+              <w:b w:val="1"/>
+              <w:bCs w:val="1"/>
               <w:i w:val="0"/>
-              <w:smallCaps w:val="0"/>
-              <w:strike w:val="0"/>
-              <w:color w:val="000000"/>
-              <w:sz w:val="24"/>
-              <w:szCs w:val="24"/>
-              <w:u w:val="none"/>
-              <w:shd w:fill="auto" w:val="clear"/>
-              <w:vertAlign w:val="baseline"/>
-            </w:rPr>
-          </w:pPr>
-          <w:hyperlink w:anchor="_utsik0ph650o">
-            <w:r>
-              <w:rPr>
-                <w:rFonts w:ascii="Liberation Sans" w:cs="Liberation Sans" w:eastAsia="Liberation Sans" w:hAnsi="Liberation Sans"/>
-                <w:b w:val="1"/>
-                <w:i w:val="0"/>
-                <w:smallCaps w:val="0"/>
-                <w:strike w:val="0"/>
-                <w:color w:val="000000"/>
-                <w:sz w:val="32"/>
-                <w:szCs w:val="32"/>
-                <w:u w:val="none"/>
-                <w:shd w:fill="auto" w:val="clear"/>
-                <w:vertAlign w:val="baseline"/>
-                <w:rtl w:val="0"/>
-              </w:rPr>
-              <w:t xml:space="preserve">2.</w:t>
-            </w:r>
-          </w:hyperlink>
-          <w:hyperlink w:anchor="_utsik0ph650o">
-            <w:r>
-              <w:rPr>
-                <w:rFonts w:ascii="Calibri" w:cs="Calibri" w:eastAsia="Calibri" w:hAnsi="Calibri"/>
-                <w:b w:val="0"/>
-                <w:i w:val="0"/>
-                <w:smallCaps w:val="0"/>
-                <w:strike w:val="0"/>
-                <w:color w:val="000000"/>
-                <w:sz w:val="24"/>
-                <w:szCs w:val="24"/>
-                <w:u w:val="none"/>
-                <w:shd w:fill="auto" w:val="clear"/>
-                <w:vertAlign w:val="baseline"/>
-                <w:rtl w:val="0"/>
-              </w:rPr>
-              <w:tab/>
-            </w:r>
-          </w:hyperlink>
-          <w:r>
-            <w:fldChar w:fldCharType="begin"/>
-            <w:instrText xml:space="preserve"> PAGEREF _utsik0ph650o \h </w:instrText>
-            <w:fldChar w:fldCharType="separate"/>
-          </w:r>
-          <w:r>
-            <w:rPr>
-              <w:rFonts w:ascii="Liberation Sans" w:cs="Liberation Sans" w:eastAsia="Liberation Sans" w:hAnsi="Liberation Sans"/>
-              <w:b w:val="1"/>
-              <w:i w:val="0"/>
-              <w:smallCaps w:val="0"/>
-              <w:strike w:val="0"/>
-              <w:color w:val="000000"/>
-              <w:sz w:val="32"/>
-              <w:szCs w:val="32"/>
-              <w:u w:val="none"/>
-              <w:shd w:fill="auto" w:val="clear"/>
-              <w:vertAlign w:val="baseline"/>
-              <w:rtl w:val="0"/>
-            </w:rPr>
-            <w:t xml:space="preserve">План работы</w:t>
-            <w:tab/>
-            <w:t xml:space="preserve">2</w:t>
-          </w:r>
-          <w:r>
-            <w:fldChar w:fldCharType="end"/>
-          </w:r>
-          <w:r>
-            <w:rPr>
-              <w:rtl w:val="0"/>
-            </w:rPr>
-          </w:r>
-        </w:p>
-        <w:p>
-          <w:pPr>
-            <w:keepNext w:val="1"/>
-            <w:keepLines w:val="0"/>
-            <w:pageBreakBefore w:val="0"/>
-            <w:widowControl w:val="1"/>
-            <w:pBdr>
-              <w:top w:space="0" w:sz="0" w:val="nil"/>
-              <w:left w:space="0" w:sz="0" w:val="nil"/>
-              <w:bottom w:space="0" w:sz="0" w:val="nil"/>
-              <w:right w:space="0" w:sz="0" w:val="nil"/>
-              <w:between w:space="0" w:sz="0" w:val="nil"/>
-            </w:pBdr>
-            <w:shd w:fill="auto" w:val="clear"/>
-            <w:tabs>
-              <w:tab w:val="right" w:leader="none" w:pos="9638"/>
-              <w:tab w:val="left" w:leader="none" w:pos="1440"/>
-            </w:tabs>
-            <w:spacing w:after="120" w:before="240" w:line="360" w:lineRule="auto"/>
-            <w:ind w:left="0" w:right="0" w:firstLine="709"/>
-            <w:jc w:val="both"/>
-            <w:rPr>
-              <w:rFonts w:ascii="Calibri" w:cs="Calibri" w:eastAsia="Calibri" w:hAnsi="Calibri"/>
-              <w:b w:val="0"/>
-              <w:i w:val="0"/>
-              <w:smallCaps w:val="0"/>
-              <w:strike w:val="0"/>
-              <w:color w:val="000000"/>
-              <w:sz w:val="24"/>
-              <w:szCs w:val="24"/>
-              <w:u w:val="none"/>
-              <w:shd w:fill="auto" w:val="clear"/>
-              <w:vertAlign w:val="baseline"/>
-            </w:rPr>
-          </w:pPr>
-          <w:hyperlink w:anchor="_hitxp4gejzwi">
-            <w:r>
-              <w:rPr>
-                <w:rFonts w:ascii="Liberation Sans" w:cs="Liberation Sans" w:eastAsia="Liberation Sans" w:hAnsi="Liberation Sans"/>
-                <w:b w:val="1"/>
-                <w:i w:val="0"/>
-                <w:smallCaps w:val="0"/>
-                <w:strike w:val="0"/>
-                <w:color w:val="000000"/>
-                <w:sz w:val="32"/>
-                <w:szCs w:val="32"/>
-                <w:u w:val="none"/>
-                <w:shd w:fill="auto" w:val="clear"/>
-                <w:vertAlign w:val="baseline"/>
-                <w:rtl w:val="0"/>
-              </w:rPr>
-              <w:t xml:space="preserve">3.</w:t>
-            </w:r>
-          </w:hyperlink>
-          <w:hyperlink w:anchor="_hitxp4gejzwi">
-            <w:r>
-              <w:rPr>
-                <w:rFonts w:ascii="Calibri" w:cs="Calibri" w:eastAsia="Calibri" w:hAnsi="Calibri"/>
-                <w:b w:val="0"/>
-                <w:i w:val="0"/>
-                <w:smallCaps w:val="0"/>
-                <w:strike w:val="0"/>
-                <w:color w:val="000000"/>
-                <w:sz w:val="24"/>
-                <w:szCs w:val="24"/>
-                <w:u w:val="none"/>
-                <w:shd w:fill="auto" w:val="clear"/>
-                <w:vertAlign w:val="baseline"/>
-                <w:rtl w:val="0"/>
-              </w:rPr>
-              <w:tab/>
-            </w:r>
-          </w:hyperlink>
-          <w:r>
-            <w:fldChar w:fldCharType="begin"/>
-            <w:instrText xml:space="preserve"> PAGEREF _hitxp4gejzwi \h </w:instrText>
-            <w:fldChar w:fldCharType="separate"/>
-          </w:r>
-          <w:r>
-            <w:rPr>
-              <w:rFonts w:ascii="Liberation Sans" w:cs="Liberation Sans" w:eastAsia="Liberation Sans" w:hAnsi="Liberation Sans"/>
-              <w:b w:val="1"/>
-              <w:i w:val="0"/>
-              <w:smallCaps w:val="0"/>
-              <w:strike w:val="0"/>
-              <w:color w:val="000000"/>
-              <w:sz w:val="32"/>
-              <w:szCs w:val="32"/>
-              <w:u w:val="none"/>
-              <w:shd w:fill="auto" w:val="clear"/>
-              <w:vertAlign w:val="baseline"/>
-              <w:rtl w:val="0"/>
-            </w:rPr>
-            <w:t xml:space="preserve">Ход работы</w:t>
-            <w:tab/>
-            <w:t xml:space="preserve">2</w:t>
-          </w:r>
-          <w:r>
-            <w:fldChar w:fldCharType="end"/>
-          </w:r>
-          <w:r>
-            <w:rPr>
-              <w:rtl w:val="0"/>
-            </w:rPr>
-          </w:r>
-        </w:p>
-        <w:p>
-          <w:pPr>
-            <w:keepNext w:val="0"/>
-            <w:keepLines w:val="0"/>
-            <w:pageBreakBefore w:val="0"/>
-            <w:widowControl w:val="1"/>
-            <w:pBdr>
-              <w:top w:space="0" w:sz="0" w:val="nil"/>
-              <w:left w:space="0" w:sz="0" w:val="nil"/>
-              <w:bottom w:space="0" w:sz="0" w:val="nil"/>
-              <w:right w:space="0" w:sz="0" w:val="nil"/>
-              <w:between w:space="0" w:sz="0" w:val="nil"/>
-            </w:pBdr>
-            <w:shd w:fill="auto" w:val="clear"/>
-            <w:tabs>
-              <w:tab w:val="left" w:leader="none" w:pos="1680"/>
-              <w:tab w:val="right" w:leader="none" w:pos="9628"/>
-            </w:tabs>
-            <w:spacing w:after="100" w:before="0" w:line="360" w:lineRule="auto"/>
-            <w:ind w:left="240" w:right="0" w:firstLine="469.00000000000006"/>
-            <w:jc w:val="both"/>
-            <w:rPr>
-              <w:rFonts w:ascii="Calibri" w:cs="Calibri" w:eastAsia="Calibri" w:hAnsi="Calibri"/>
-              <w:b w:val="0"/>
-              <w:i w:val="0"/>
-              <w:smallCaps w:val="0"/>
-              <w:strike w:val="0"/>
-              <w:color w:val="000000"/>
-              <w:sz w:val="24"/>
-              <w:szCs w:val="24"/>
-              <w:u w:val="none"/>
-              <w:shd w:fill="auto" w:val="clear"/>
-              <w:vertAlign w:val="baseline"/>
-            </w:rPr>
-          </w:pPr>
-          <w:hyperlink w:anchor="_ey5h938zw44y">
-            <w:r>
-              <w:rPr>
-                <w:rFonts w:ascii="Times New Roman" w:cs="Times New Roman" w:eastAsia="Times New Roman" w:hAnsi="Times New Roman"/>
-                <w:b w:val="0"/>
-                <w:i w:val="0"/>
-                <w:smallCaps w:val="0"/>
-                <w:strike w:val="0"/>
-                <w:color w:val="000000"/>
-                <w:sz w:val="28"/>
-                <w:szCs w:val="28"/>
-                <w:u w:val="none"/>
-                <w:shd w:fill="auto" w:val="clear"/>
-                <w:vertAlign w:val="baseline"/>
-                <w:rtl w:val="0"/>
-              </w:rPr>
-              <w:t xml:space="preserve">3.1.</w:t>
-            </w:r>
-          </w:hyperlink>
-          <w:hyperlink w:anchor="_ey5h938zw44y">
-            <w:r>
-              <w:rPr>
-                <w:rFonts w:ascii="Calibri" w:cs="Calibri" w:eastAsia="Calibri" w:hAnsi="Calibri"/>
-                <w:b w:val="0"/>
-                <w:i w:val="0"/>
-                <w:smallCaps w:val="0"/>
-                <w:strike w:val="0"/>
-                <w:color w:val="000000"/>
-                <w:sz w:val="24"/>
-                <w:szCs w:val="24"/>
-                <w:u w:val="none"/>
-                <w:shd w:fill="auto" w:val="clear"/>
-                <w:vertAlign w:val="baseline"/>
-                <w:rtl w:val="0"/>
-              </w:rPr>
-              <w:tab/>
-            </w:r>
-          </w:hyperlink>
-          <w:r>
-            <w:fldChar w:fldCharType="begin"/>
-            <w:instrText xml:space="preserve"> PAGEREF _ey5h938zw44y \h </w:instrText>
-            <w:fldChar w:fldCharType="separate"/>
-          </w:r>
-          <w:r>
-            <w:rPr>
-              <w:rFonts w:ascii="Times New Roman" w:cs="Times New Roman" w:eastAsia="Times New Roman" w:hAnsi="Times New Roman"/>
-              <w:b w:val="0"/>
-              <w:i w:val="0"/>
-              <w:smallCaps w:val="0"/>
-              <w:strike w:val="0"/>
-              <w:color w:val="000000"/>
-              <w:sz w:val="28"/>
-              <w:szCs w:val="28"/>
-              <w:u w:val="none"/>
-              <w:shd w:fill="auto" w:val="clear"/>
-              <w:vertAlign w:val="baseline"/>
-              <w:rtl w:val="0"/>
-            </w:rPr>
-            <w:t xml:space="preserve">Разработка синтаксического анализатора</w:t>
-            <w:tab/>
-            <w:t xml:space="preserve">2</w:t>
-          </w:r>
-          <w:r>
-            <w:fldChar w:fldCharType="end"/>
-          </w:r>
-          <w:r>
-            <w:rPr>
-              <w:rtl w:val="0"/>
-            </w:rPr>
-          </w:r>
-        </w:p>
-        <w:p>
-          <w:pPr>
-            <w:keepNext w:val="0"/>
-            <w:keepLines w:val="0"/>
-            <w:pageBreakBefore w:val="0"/>
-            <w:widowControl w:val="1"/>
-            <w:pBdr>
-              <w:top w:space="0" w:sz="0" w:val="nil"/>
-              <w:left w:space="0" w:sz="0" w:val="nil"/>
-              <w:bottom w:space="0" w:sz="0" w:val="nil"/>
-              <w:right w:space="0" w:sz="0" w:val="nil"/>
-              <w:between w:space="0" w:sz="0" w:val="nil"/>
-            </w:pBdr>
-            <w:shd w:fill="auto" w:val="clear"/>
-            <w:tabs>
-              <w:tab w:val="left" w:leader="none" w:pos="1680"/>
-              <w:tab w:val="right" w:leader="none" w:pos="9628"/>
-            </w:tabs>
-            <w:spacing w:after="100" w:before="0" w:line="360" w:lineRule="auto"/>
-            <w:ind w:left="240" w:right="0" w:firstLine="469.00000000000006"/>
-            <w:jc w:val="both"/>
-            <w:rPr>
-              <w:rFonts w:ascii="Calibri" w:cs="Calibri" w:eastAsia="Calibri" w:hAnsi="Calibri"/>
-              <w:b w:val="0"/>
-              <w:i w:val="0"/>
-              <w:smallCaps w:val="0"/>
-              <w:strike w:val="0"/>
-              <w:color w:val="000000"/>
-              <w:sz w:val="24"/>
-              <w:szCs w:val="24"/>
-              <w:u w:val="none"/>
-              <w:shd w:fill="auto" w:val="clear"/>
-              <w:vertAlign w:val="baseline"/>
-            </w:rPr>
-          </w:pPr>
-          <w:hyperlink w:anchor="_emi7zyl3te32">
-            <w:r>
-              <w:rPr>
-                <w:rFonts w:ascii="Times New Roman" w:cs="Times New Roman" w:eastAsia="Times New Roman" w:hAnsi="Times New Roman"/>
-                <w:b w:val="0"/>
-                <w:i w:val="0"/>
-                <w:smallCaps w:val="0"/>
-                <w:strike w:val="0"/>
-                <w:color w:val="000000"/>
-                <w:sz w:val="28"/>
-                <w:szCs w:val="28"/>
-                <w:u w:val="none"/>
-                <w:shd w:fill="auto" w:val="clear"/>
-                <w:vertAlign w:val="baseline"/>
-                <w:rtl w:val="0"/>
-              </w:rPr>
-              <w:t xml:space="preserve">3.2.</w:t>
-            </w:r>
-          </w:hyperlink>
-          <w:hyperlink w:anchor="_emi7zyl3te32">
-            <w:r>
-              <w:rPr>
-                <w:rFonts w:ascii="Calibri" w:cs="Calibri" w:eastAsia="Calibri" w:hAnsi="Calibri"/>
-                <w:b w:val="0"/>
-                <w:i w:val="0"/>
-                <w:smallCaps w:val="0"/>
-                <w:strike w:val="0"/>
-                <w:color w:val="000000"/>
-                <w:sz w:val="24"/>
-                <w:szCs w:val="24"/>
-                <w:u w:val="none"/>
-                <w:shd w:fill="auto" w:val="clear"/>
-                <w:vertAlign w:val="baseline"/>
-                <w:rtl w:val="0"/>
-              </w:rPr>
-              <w:tab/>
-            </w:r>
-          </w:hyperlink>
-          <w:r>
-            <w:fldChar w:fldCharType="begin"/>
-            <w:instrText xml:space="preserve"> PAGEREF _emi7zyl3te32 \h </w:instrText>
-            <w:fldChar w:fldCharType="separate"/>
-          </w:r>
-          <w:r>
-            <w:rPr>
-              <w:rFonts w:ascii="Times New Roman" w:cs="Times New Roman" w:eastAsia="Times New Roman" w:hAnsi="Times New Roman"/>
-              <w:b w:val="0"/>
-              <w:i w:val="0"/>
-              <w:smallCaps w:val="0"/>
-              <w:strike w:val="0"/>
-              <w:color w:val="000000"/>
-              <w:sz w:val="28"/>
-              <w:szCs w:val="28"/>
-              <w:u w:val="none"/>
-              <w:shd w:fill="auto" w:val="clear"/>
-              <w:vertAlign w:val="baseline"/>
-              <w:rtl w:val="0"/>
-            </w:rPr>
-            <w:t xml:space="preserve">Разработка тестовой программы</w:t>
-            <w:tab/>
-            <w:t xml:space="preserve">9</w:t>
-          </w:r>
-          <w:r>
-            <w:fldChar w:fldCharType="end"/>
-          </w:r>
-          <w:r>
-            <w:rPr>
-              <w:rtl w:val="0"/>
-            </w:rPr>
-          </w:r>
-        </w:p>
-        <w:p>
-          <w:pPr>
-            <w:keepNext w:val="0"/>
-            <w:keepLines w:val="0"/>
-            <w:pageBreakBefore w:val="0"/>
-            <w:widowControl w:val="1"/>
-            <w:pBdr>
-              <w:top w:space="0" w:sz="0" w:val="nil"/>
-              <w:left w:space="0" w:sz="0" w:val="nil"/>
-              <w:bottom w:space="0" w:sz="0" w:val="nil"/>
-              <w:right w:space="0" w:sz="0" w:val="nil"/>
-              <w:between w:space="0" w:sz="0" w:val="nil"/>
-            </w:pBdr>
-            <w:shd w:fill="auto" w:val="clear"/>
-            <w:tabs>
-              <w:tab w:val="left" w:leader="none" w:pos="1680"/>
-              <w:tab w:val="right" w:leader="none" w:pos="9628"/>
-            </w:tabs>
-            <w:spacing w:after="100" w:before="0" w:line="360" w:lineRule="auto"/>
-            <w:ind w:left="240" w:right="0" w:firstLine="469.00000000000006"/>
-            <w:jc w:val="both"/>
-            <w:rPr>
-              <w:rFonts w:ascii="Calibri" w:cs="Calibri" w:eastAsia="Calibri" w:hAnsi="Calibri"/>
-              <w:b w:val="0"/>
-              <w:i w:val="0"/>
-              <w:smallCaps w:val="0"/>
-              <w:strike w:val="0"/>
-              <w:color w:val="000000"/>
-              <w:sz w:val="24"/>
-              <w:szCs w:val="24"/>
-              <w:u w:val="none"/>
-              <w:shd w:fill="auto" w:val="clear"/>
-              <w:vertAlign w:val="baseline"/>
-            </w:rPr>
-          </w:pPr>
-          <w:hyperlink w:anchor="_8nj9wb68j9fd">
-            <w:r>
-              <w:rPr>
-                <w:rFonts w:ascii="Times New Roman" w:cs="Times New Roman" w:eastAsia="Times New Roman" w:hAnsi="Times New Roman"/>
-                <w:b w:val="0"/>
-                <w:i w:val="0"/>
-                <w:smallCaps w:val="0"/>
-                <w:strike w:val="0"/>
-                <w:color w:val="000000"/>
-                <w:sz w:val="28"/>
-                <w:szCs w:val="28"/>
-                <w:u w:val="none"/>
-                <w:shd w:fill="auto" w:val="clear"/>
-                <w:vertAlign w:val="baseline"/>
-                <w:rtl w:val="0"/>
-              </w:rPr>
-              <w:t xml:space="preserve">3.3.</w:t>
-            </w:r>
-          </w:hyperlink>
-          <w:hyperlink w:anchor="_8nj9wb68j9fd">
-            <w:r>
-              <w:rPr>
-                <w:rFonts w:ascii="Calibri" w:cs="Calibri" w:eastAsia="Calibri" w:hAnsi="Calibri"/>
-                <w:b w:val="0"/>
-                <w:i w:val="0"/>
-                <w:smallCaps w:val="0"/>
-                <w:strike w:val="0"/>
-                <w:color w:val="000000"/>
-                <w:sz w:val="24"/>
-                <w:szCs w:val="24"/>
-                <w:u w:val="none"/>
-                <w:shd w:fill="auto" w:val="clear"/>
-                <w:vertAlign w:val="baseline"/>
-                <w:rtl w:val="0"/>
-              </w:rPr>
-              <w:tab/>
-            </w:r>
-          </w:hyperlink>
-          <w:r>
-            <w:fldChar w:fldCharType="begin"/>
-            <w:instrText xml:space="preserve"> PAGEREF _8nj9wb68j9fd \h </w:instrText>
-            <w:fldChar w:fldCharType="separate"/>
-          </w:r>
-          <w:r>
-            <w:rPr>
-              <w:rFonts w:ascii="Times New Roman" w:cs="Times New Roman" w:eastAsia="Times New Roman" w:hAnsi="Times New Roman"/>
-              <w:b w:val="0"/>
-              <w:i w:val="0"/>
-              <w:smallCaps w:val="0"/>
-              <w:strike w:val="0"/>
-              <w:color w:val="000000"/>
-              <w:sz w:val="28"/>
-              <w:szCs w:val="28"/>
-              <w:u w:val="none"/>
-              <w:shd w:fill="auto" w:val="clear"/>
-              <w:vertAlign w:val="baseline"/>
-              <w:rtl w:val="0"/>
-            </w:rPr>
-            <w:t xml:space="preserve">Тестирование разработанной грамматики</w:t>
-            <w:tab/>
-            <w:t xml:space="preserve">13</w:t>
-          </w:r>
-          <w:r>
-            <w:fldChar w:fldCharType="end"/>
-          </w:r>
-          <w:r>
-            <w:rPr>
-              <w:rtl w:val="0"/>
-            </w:rPr>
-          </w:r>
-        </w:p>
-        <w:p>
-          <w:pPr>
-            <w:keepNext w:val="1"/>
-            <w:keepLines w:val="0"/>
-            <w:pageBreakBefore w:val="0"/>
-            <w:widowControl w:val="1"/>
-            <w:pBdr>
-              <w:top w:space="0" w:sz="0" w:val="nil"/>
-              <w:left w:space="0" w:sz="0" w:val="nil"/>
-              <w:bottom w:space="0" w:sz="0" w:val="nil"/>
-              <w:right w:space="0" w:sz="0" w:val="nil"/>
-              <w:between w:space="0" w:sz="0" w:val="nil"/>
-            </w:pBdr>
-            <w:shd w:fill="auto" w:val="clear"/>
-            <w:tabs>
-              <w:tab w:val="right" w:leader="none" w:pos="9638"/>
-              <w:tab w:val="left" w:leader="none" w:pos="1440"/>
-            </w:tabs>
-            <w:spacing w:after="120" w:before="240" w:line="360" w:lineRule="auto"/>
-            <w:ind w:left="0" w:right="0" w:firstLine="709"/>
-            <w:jc w:val="both"/>
-            <w:rPr>
-              <w:rFonts w:ascii="Calibri" w:cs="Calibri" w:eastAsia="Calibri" w:hAnsi="Calibri"/>
-              <w:b w:val="0"/>
-              <w:i w:val="0"/>
-              <w:smallCaps w:val="0"/>
-              <w:strike w:val="0"/>
-              <w:color w:val="000000"/>
-              <w:sz w:val="24"/>
-              <w:szCs w:val="24"/>
-              <w:u w:val="none"/>
-              <w:shd w:fill="auto" w:val="clear"/>
-              <w:vertAlign w:val="baseline"/>
-            </w:rPr>
-          </w:pPr>
-          <w:hyperlink w:anchor="_whacatd9drm8">
-            <w:r>
-              <w:rPr>
-                <w:rFonts w:ascii="Liberation Sans" w:cs="Liberation Sans" w:eastAsia="Liberation Sans" w:hAnsi="Liberation Sans"/>
-                <w:b w:val="1"/>
-                <w:i w:val="0"/>
-                <w:smallCaps w:val="0"/>
-                <w:strike w:val="0"/>
-                <w:color w:val="000000"/>
-                <w:sz w:val="32"/>
-                <w:szCs w:val="32"/>
-                <w:u w:val="none"/>
-                <w:shd w:fill="auto" w:val="clear"/>
-                <w:vertAlign w:val="baseline"/>
-                <w:rtl w:val="0"/>
-              </w:rPr>
-              <w:t xml:space="preserve">4.</w:t>
-            </w:r>
-          </w:hyperlink>
-          <w:hyperlink w:anchor="_whacatd9drm8">
-            <w:r>
-              <w:rPr>
-                <w:rFonts w:ascii="Calibri" w:cs="Calibri" w:eastAsia="Calibri" w:hAnsi="Calibri"/>
-                <w:b w:val="0"/>
-                <w:i w:val="0"/>
-                <w:smallCaps w:val="0"/>
-                <w:strike w:val="0"/>
-                <w:color w:val="000000"/>
-                <w:sz w:val="24"/>
-                <w:szCs w:val="24"/>
-                <w:u w:val="none"/>
-                <w:shd w:fill="auto" w:val="clear"/>
-                <w:vertAlign w:val="baseline"/>
-                <w:rtl w:val="0"/>
-              </w:rPr>
-              <w:tab/>
-            </w:r>
-          </w:hyperlink>
-          <w:r>
-            <w:fldChar w:fldCharType="begin"/>
-            <w:instrText xml:space="preserve"> PAGEREF _whacatd9drm8 \h </w:instrText>
-            <w:fldChar w:fldCharType="separate"/>
-          </w:r>
-          <w:r>
-            <w:rPr>
-              <w:rFonts w:ascii="Liberation Sans" w:cs="Liberation Sans" w:eastAsia="Liberation Sans" w:hAnsi="Liberation Sans"/>
-              <w:b w:val="1"/>
-              <w:i w:val="0"/>
-              <w:smallCaps w:val="0"/>
-              <w:strike w:val="0"/>
-              <w:color w:val="000000"/>
-              <w:sz w:val="32"/>
-              <w:szCs w:val="32"/>
-              <w:u w:val="none"/>
-              <w:shd w:fill="auto" w:val="clear"/>
-              <w:vertAlign w:val="baseline"/>
-              <w:rtl w:val="0"/>
-            </w:rPr>
-            <w:t xml:space="preserve">Вывод</w:t>
-            <w:tab/>
-            <w:t xml:space="preserve">19</w:t>
-          </w:r>
-          <w:r>
-            <w:fldChar w:fldCharType="end"/>
-          </w:r>
-          <w:r>
-            <w:rPr>
-              <w:rtl w:val="0"/>
-            </w:rPr>
-          </w:r>
-        </w:p>
-        <w:p>
-          <w:pPr>
-            <w:keepNext w:val="1"/>
-            <w:keepLines w:val="0"/>
-            <w:pageBreakBefore w:val="0"/>
-            <w:widowControl w:val="1"/>
-            <w:pBdr>
-              <w:top w:space="0" w:sz="0" w:val="nil"/>
-              <w:left w:space="0" w:sz="0" w:val="nil"/>
-              <w:bottom w:space="0" w:sz="0" w:val="nil"/>
-              <w:right w:space="0" w:sz="0" w:val="nil"/>
-              <w:between w:space="0" w:sz="0" w:val="nil"/>
-            </w:pBdr>
-            <w:shd w:fill="auto" w:val="clear"/>
-            <w:tabs>
-              <w:tab w:val="right" w:leader="none" w:pos="9638"/>
-            </w:tabs>
-            <w:spacing w:after="120" w:before="240" w:line="360" w:lineRule="auto"/>
-            <w:ind w:left="0" w:right="0" w:firstLine="709"/>
-            <w:jc w:val="both"/>
-            <w:rPr>
-              <w:rFonts w:ascii="Times New Roman" w:cs="Times New Roman" w:eastAsia="Times New Roman" w:hAnsi="Times New Roman"/>
-              <w:b w:val="1"/>
-              <w:i w:val="0"/>
+              <w:iCs w:val="0"/>
               <w:smallCaps w:val="0"/>
               <w:strike w:val="0"/>
               <w:color w:val="000000"/>
@@ -2339,6 +1733,328 @@
               <w:vertAlign w:val="baseline"/>
             </w:rPr>
           </w:pPr>
+          <w:hyperlink w:anchor="_utsik0ph650o">
+            <w:r>
+              <w:rPr>
+                <w:b w:val="1"/>
+                <w:bCs w:val="1"/>
+                <w:i w:val="0"/>
+                <w:iCs w:val="0"/>
+                <w:smallCaps w:val="0"/>
+                <w:strike w:val="0"/>
+                <w:color w:val="000000"/>
+                <w:sz w:val="32"/>
+                <w:szCs w:val="32"/>
+                <w:u w:val="none"/>
+                <w:shd w:fill="auto" w:val="clear"/>
+                <w:vertAlign w:val="baseline"/>
+                <w:rtl w:val="0"/>
+              </w:rPr>
+              <w:t xml:space="preserve">2. План работы</w:t>
+              <w:tab/>
+              <w:t xml:space="preserve">2</w:t>
+            </w:r>
+          </w:hyperlink>
+          <w:r>
+            <w:rPr>
+              <w:rtl w:val="0"/>
+            </w:rPr>
+          </w:r>
+        </w:p>
+        <w:p>
+          <w:pPr>
+            <w:widowControl w:val="0"/>
+            <w:tabs>
+              <w:tab w:val="right" w:leader="none" w:pos="12000"/>
+            </w:tabs>
+            <w:spacing w:after="0" w:before="60" w:line="360" w:lineRule="auto"/>
+            <w:ind w:firstLine="0"/>
+            <w:jc w:val="left"/>
+            <w:rPr>
+              <w:b w:val="1"/>
+              <w:bCs w:val="1"/>
+              <w:i w:val="0"/>
+              <w:iCs w:val="0"/>
+              <w:smallCaps w:val="0"/>
+              <w:strike w:val="0"/>
+              <w:color w:val="000000"/>
+              <w:sz w:val="32"/>
+              <w:szCs w:val="32"/>
+              <w:u w:val="none"/>
+              <w:shd w:fill="auto" w:val="clear"/>
+              <w:vertAlign w:val="baseline"/>
+            </w:rPr>
+          </w:pPr>
+          <w:hyperlink w:anchor="_hitxp4gejzwi">
+            <w:r>
+              <w:rPr>
+                <w:b w:val="1"/>
+                <w:bCs w:val="1"/>
+                <w:i w:val="0"/>
+                <w:iCs w:val="0"/>
+                <w:smallCaps w:val="0"/>
+                <w:strike w:val="0"/>
+                <w:color w:val="000000"/>
+                <w:sz w:val="32"/>
+                <w:szCs w:val="32"/>
+                <w:u w:val="none"/>
+                <w:shd w:fill="auto" w:val="clear"/>
+                <w:vertAlign w:val="baseline"/>
+                <w:rtl w:val="0"/>
+              </w:rPr>
+              <w:t xml:space="preserve">3. Ход работы</w:t>
+              <w:tab/>
+              <w:t xml:space="preserve">2</w:t>
+            </w:r>
+          </w:hyperlink>
+          <w:r>
+            <w:rPr>
+              <w:rtl w:val="0"/>
+            </w:rPr>
+          </w:r>
+        </w:p>
+        <w:p>
+          <w:pPr>
+            <w:widowControl w:val="0"/>
+            <w:tabs>
+              <w:tab w:val="right" w:leader="none" w:pos="12000"/>
+            </w:tabs>
+            <w:spacing w:after="0" w:before="60" w:line="360" w:lineRule="auto"/>
+            <w:ind w:left="360" w:firstLine="0"/>
+            <w:jc w:val="left"/>
+            <w:rPr>
+              <w:i w:val="0"/>
+              <w:iCs w:val="0"/>
+              <w:smallCaps w:val="0"/>
+              <w:strike w:val="0"/>
+              <w:color w:val="000000"/>
+              <w:sz w:val="22"/>
+              <w:szCs w:val="22"/>
+              <w:u w:val="none"/>
+              <w:shd w:fill="auto" w:val="clear"/>
+              <w:vertAlign w:val="baseline"/>
+            </w:rPr>
+          </w:pPr>
+          <w:hyperlink w:anchor="_ey5h938zw44y">
+            <w:r>
+              <w:rPr>
+                <w:i w:val="0"/>
+                <w:iCs w:val="0"/>
+                <w:smallCaps w:val="0"/>
+                <w:strike w:val="0"/>
+                <w:color w:val="000000"/>
+                <w:sz w:val="28"/>
+                <w:szCs w:val="28"/>
+                <w:u w:val="none"/>
+                <w:shd w:fill="auto" w:val="clear"/>
+                <w:vertAlign w:val="baseline"/>
+                <w:rtl w:val="0"/>
+              </w:rPr>
+              <w:t xml:space="preserve">3.1. Разработка синтаксического анализатора</w:t>
+              <w:tab/>
+              <w:t xml:space="preserve">2</w:t>
+            </w:r>
+          </w:hyperlink>
+          <w:r>
+            <w:rPr>
+              <w:rtl w:val="0"/>
+            </w:rPr>
+          </w:r>
+        </w:p>
+        <w:p>
+          <w:pPr>
+            <w:widowControl w:val="0"/>
+            <w:tabs>
+              <w:tab w:val="right" w:leader="none" w:pos="12000"/>
+            </w:tabs>
+            <w:spacing w:after="0" w:before="60" w:line="360" w:lineRule="auto"/>
+            <w:ind w:left="360" w:firstLine="0"/>
+            <w:jc w:val="left"/>
+            <w:rPr>
+              <w:i w:val="0"/>
+              <w:iCs w:val="0"/>
+              <w:smallCaps w:val="0"/>
+              <w:strike w:val="0"/>
+              <w:color w:val="000000"/>
+              <w:sz w:val="22"/>
+              <w:szCs w:val="22"/>
+              <w:u w:val="none"/>
+              <w:shd w:fill="auto" w:val="clear"/>
+              <w:vertAlign w:val="baseline"/>
+            </w:rPr>
+          </w:pPr>
+          <w:hyperlink w:anchor="_emi7zyl3te32">
+            <w:r>
+              <w:rPr>
+                <w:i w:val="0"/>
+                <w:iCs w:val="0"/>
+                <w:smallCaps w:val="0"/>
+                <w:strike w:val="0"/>
+                <w:color w:val="000000"/>
+                <w:sz w:val="28"/>
+                <w:szCs w:val="28"/>
+                <w:u w:val="none"/>
+                <w:shd w:fill="auto" w:val="clear"/>
+                <w:vertAlign w:val="baseline"/>
+                <w:rtl w:val="0"/>
+              </w:rPr>
+              <w:t xml:space="preserve">3.2. Разработка тестовой программы</w:t>
+              <w:tab/>
+              <w:t xml:space="preserve">7</w:t>
+            </w:r>
+          </w:hyperlink>
+          <w:r>
+            <w:rPr>
+              <w:rtl w:val="0"/>
+            </w:rPr>
+          </w:r>
+        </w:p>
+        <w:p>
+          <w:pPr>
+            <w:widowControl w:val="0"/>
+            <w:tabs>
+              <w:tab w:val="right" w:leader="none" w:pos="12000"/>
+            </w:tabs>
+            <w:spacing w:after="0" w:before="60" w:line="360" w:lineRule="auto"/>
+            <w:ind w:left="360" w:firstLine="0"/>
+            <w:jc w:val="left"/>
+            <w:rPr>
+              <w:i w:val="0"/>
+              <w:iCs w:val="0"/>
+              <w:smallCaps w:val="0"/>
+              <w:strike w:val="0"/>
+              <w:color w:val="000000"/>
+              <w:sz w:val="22"/>
+              <w:szCs w:val="22"/>
+              <w:u w:val="none"/>
+              <w:shd w:fill="auto" w:val="clear"/>
+              <w:vertAlign w:val="baseline"/>
+            </w:rPr>
+          </w:pPr>
+          <w:hyperlink w:anchor="_8nj9wb68j9fd">
+            <w:r>
+              <w:rPr>
+                <w:i w:val="0"/>
+                <w:iCs w:val="0"/>
+                <w:smallCaps w:val="0"/>
+                <w:strike w:val="0"/>
+                <w:color w:val="000000"/>
+                <w:sz w:val="28"/>
+                <w:szCs w:val="28"/>
+                <w:u w:val="none"/>
+                <w:shd w:fill="auto" w:val="clear"/>
+                <w:vertAlign w:val="baseline"/>
+                <w:rtl w:val="0"/>
+              </w:rPr>
+              <w:t xml:space="preserve">3.3. Тестирование разработанной грамматики</w:t>
+              <w:tab/>
+              <w:t xml:space="preserve">10</w:t>
+            </w:r>
+          </w:hyperlink>
+          <w:r>
+            <w:rPr>
+              <w:rtl w:val="0"/>
+            </w:rPr>
+          </w:r>
+        </w:p>
+        <w:p>
+          <w:pPr>
+            <w:widowControl w:val="0"/>
+            <w:tabs>
+              <w:tab w:val="right" w:leader="none" w:pos="12000"/>
+            </w:tabs>
+            <w:spacing w:after="0" w:before="60" w:line="360" w:lineRule="auto"/>
+            <w:ind w:firstLine="0"/>
+            <w:jc w:val="left"/>
+            <w:rPr>
+              <w:b w:val="1"/>
+              <w:bCs w:val="1"/>
+              <w:i w:val="0"/>
+              <w:iCs w:val="0"/>
+              <w:smallCaps w:val="0"/>
+              <w:strike w:val="0"/>
+              <w:color w:val="000000"/>
+              <w:sz w:val="32"/>
+              <w:szCs w:val="32"/>
+              <w:u w:val="none"/>
+              <w:shd w:fill="auto" w:val="clear"/>
+              <w:vertAlign w:val="baseline"/>
+            </w:rPr>
+          </w:pPr>
+          <w:hyperlink w:anchor="_whacatd9drm8">
+            <w:r>
+              <w:rPr>
+                <w:b w:val="1"/>
+                <w:bCs w:val="1"/>
+                <w:i w:val="0"/>
+                <w:iCs w:val="0"/>
+                <w:smallCaps w:val="0"/>
+                <w:strike w:val="0"/>
+                <w:color w:val="000000"/>
+                <w:sz w:val="32"/>
+                <w:szCs w:val="32"/>
+                <w:u w:val="none"/>
+                <w:shd w:fill="auto" w:val="clear"/>
+                <w:vertAlign w:val="baseline"/>
+                <w:rtl w:val="0"/>
+              </w:rPr>
+              <w:t xml:space="preserve">4. Вывод</w:t>
+              <w:tab/>
+              <w:t xml:space="preserve">13</w:t>
+            </w:r>
+          </w:hyperlink>
+          <w:r>
+            <w:rPr>
+              <w:rtl w:val="0"/>
+            </w:rPr>
+          </w:r>
+        </w:p>
+        <w:p>
+          <w:pPr>
+            <w:widowControl w:val="0"/>
+            <w:tabs>
+              <w:tab w:val="right" w:leader="none" w:pos="12000"/>
+            </w:tabs>
+            <w:spacing w:after="0" w:before="60" w:line="360" w:lineRule="auto"/>
+            <w:ind w:firstLine="0"/>
+            <w:jc w:val="left"/>
+            <w:rPr>
+              <w:b w:val="1"/>
+              <w:bCs w:val="1"/>
+              <w:i w:val="0"/>
+              <w:iCs w:val="0"/>
+              <w:smallCaps w:val="0"/>
+              <w:strike w:val="0"/>
+              <w:color w:val="000000"/>
+              <w:sz w:val="32"/>
+              <w:szCs w:val="32"/>
+              <w:u w:val="none"/>
+              <w:shd w:fill="auto" w:val="clear"/>
+              <w:vertAlign w:val="baseline"/>
+            </w:rPr>
+          </w:pPr>
+          <w:hyperlink w:anchor="">
+            <w:r>
+              <w:rPr>
+                <w:b w:val="1"/>
+                <w:bCs w:val="1"/>
+                <w:i w:val="0"/>
+                <w:iCs w:val="0"/>
+                <w:smallCaps w:val="0"/>
+                <w:strike w:val="0"/>
+                <w:color w:val="000000"/>
+                <w:sz w:val="32"/>
+                <w:szCs w:val="32"/>
+                <w:u w:val="none"/>
+                <w:shd w:fill="auto" w:val="clear"/>
+                <w:vertAlign w:val="baseline"/>
+                <w:rtl w:val="0"/>
+              </w:rPr>
+              <w:t xml:space="preserve">5. Исходные файлы</w:t>
+              <w:tab/>
+              <w:t xml:space="preserve">13</w:t>
+            </w:r>
+          </w:hyperlink>
           <w:r>
             <w:rPr>
               <w:rtl w:val="0"/>
@@ -2355,6 +2071,7 @@
         <w:spacing w:line="240" w:lineRule="auto"/>
         <w:rPr>
           <w:b w:val="1"/>
+          <w:bCs w:val="1"/>
           <w:sz w:val="36"/>
           <w:szCs w:val="36"/>
         </w:rPr>
@@ -2444,7 +2161,9 @@
         <w:rPr>
           <w:rFonts w:ascii="Times New Roman" w:cs="Times New Roman" w:eastAsia="Times New Roman" w:hAnsi="Times New Roman"/>
           <w:b w:val="0"/>
+          <w:bCs w:val="0"/>
           <w:i w:val="0"/>
+          <w:iCs w:val="0"/>
           <w:smallCaps w:val="0"/>
           <w:strike w:val="0"/>
           <w:color w:val="000000"/>
@@ -2482,7 +2201,9 @@
         <w:rPr>
           <w:rFonts w:ascii="Times New Roman" w:cs="Times New Roman" w:eastAsia="Times New Roman" w:hAnsi="Times New Roman"/>
           <w:b w:val="0"/>
+          <w:bCs w:val="0"/>
           <w:i w:val="0"/>
+          <w:iCs w:val="0"/>
           <w:smallCaps w:val="0"/>
           <w:strike w:val="0"/>
           <w:color w:val="000000"/>
@@ -2497,7 +2218,9 @@
         <w:rPr>
           <w:rFonts w:ascii="Times New Roman" w:cs="Times New Roman" w:eastAsia="Times New Roman" w:hAnsi="Times New Roman"/>
           <w:b w:val="0"/>
+          <w:bCs w:val="0"/>
           <w:i w:val="0"/>
+          <w:iCs w:val="0"/>
           <w:smallCaps w:val="0"/>
           <w:strike w:val="0"/>
           <w:color w:val="000000"/>
@@ -2514,7 +2237,9 @@
         <w:rPr>
           <w:rFonts w:ascii="Calibri" w:cs="Calibri" w:eastAsia="Calibri" w:hAnsi="Calibri"/>
           <w:b w:val="0"/>
+          <w:bCs w:val="0"/>
           <w:i w:val="0"/>
+          <w:iCs w:val="0"/>
           <w:smallCaps w:val="0"/>
           <w:strike w:val="0"/>
           <w:color w:val="000000"/>
@@ -2531,7 +2256,9 @@
         <w:rPr>
           <w:rFonts w:ascii="Times New Roman" w:cs="Times New Roman" w:eastAsia="Times New Roman" w:hAnsi="Times New Roman"/>
           <w:b w:val="0"/>
+          <w:bCs w:val="0"/>
           <w:i w:val="0"/>
+          <w:iCs w:val="0"/>
           <w:smallCaps w:val="0"/>
           <w:strike w:val="0"/>
           <w:color w:val="000000"/>
@@ -2572,7 +2299,9 @@
         <w:rPr>
           <w:rFonts w:ascii="Times New Roman" w:cs="Times New Roman" w:eastAsia="Times New Roman" w:hAnsi="Times New Roman"/>
           <w:b w:val="0"/>
+          <w:bCs w:val="0"/>
           <w:i w:val="0"/>
+          <w:iCs w:val="0"/>
           <w:smallCaps w:val="0"/>
           <w:strike w:val="0"/>
           <w:color w:val="000000"/>
@@ -2613,7 +2342,9 @@
         <w:rPr>
           <w:rFonts w:ascii="Times New Roman" w:cs="Times New Roman" w:eastAsia="Times New Roman" w:hAnsi="Times New Roman"/>
           <w:b w:val="0"/>
+          <w:bCs w:val="0"/>
           <w:i w:val="0"/>
+          <w:iCs w:val="0"/>
           <w:smallCaps w:val="0"/>
           <w:strike w:val="0"/>
           <w:color w:val="000000"/>
@@ -2915,7 +2646,9 @@
         <w:rPr>
           <w:rFonts w:ascii="Times New Roman" w:cs="Times New Roman" w:eastAsia="Times New Roman" w:hAnsi="Times New Roman"/>
           <w:b w:val="0"/>
+          <w:bCs w:val="0"/>
           <w:i w:val="1"/>
+          <w:iCs w:val="1"/>
           <w:smallCaps w:val="0"/>
           <w:strike w:val="0"/>
           <w:color w:val="000000"/>
@@ -2930,7 +2663,9 @@
         <w:rPr>
           <w:rFonts w:ascii="Times New Roman" w:cs="Times New Roman" w:eastAsia="Times New Roman" w:hAnsi="Times New Roman"/>
           <w:b w:val="0"/>
+          <w:bCs w:val="0"/>
           <w:i w:val="1"/>
+          <w:iCs w:val="1"/>
           <w:smallCaps w:val="0"/>
           <w:strike w:val="0"/>
           <w:color w:val="000000"/>
@@ -2956,12 +2691,12 @@
           <wp:inline distB="114300" distT="114300" distL="114300" distR="114300">
             <wp:extent cx="4656773" cy="3765975"/>
             <wp:effectExtent b="0" l="0" r="0" t="0"/>
-            <wp:docPr id="8" name="image13.png"/>
+            <wp:docPr id="8" name="image7.png"/>
             <a:graphic>
               <a:graphicData uri="http://schemas.openxmlformats.org/drawingml/2006/picture">
                 <pic:pic>
                   <pic:nvPicPr>
-                    <pic:cNvPr id="0" name="image13.png"/>
+                    <pic:cNvPr id="0" name="image7.png"/>
                     <pic:cNvPicPr preferRelativeResize="0"/>
                   </pic:nvPicPr>
                   <pic:blipFill>
@@ -3273,7 +3008,9 @@
         <w:rPr>
           <w:rFonts w:ascii="Times New Roman" w:cs="Times New Roman" w:eastAsia="Times New Roman" w:hAnsi="Times New Roman"/>
           <w:b w:val="0"/>
+          <w:bCs w:val="0"/>
           <w:i w:val="1"/>
+          <w:iCs w:val="1"/>
           <w:smallCaps w:val="0"/>
           <w:strike w:val="0"/>
           <w:color w:val="000000"/>
@@ -3288,7 +3025,9 @@
         <w:rPr>
           <w:rFonts w:ascii="Times New Roman" w:cs="Times New Roman" w:eastAsia="Times New Roman" w:hAnsi="Times New Roman"/>
           <w:b w:val="0"/>
+          <w:bCs w:val="0"/>
           <w:i w:val="1"/>
+          <w:iCs w:val="1"/>
           <w:smallCaps w:val="0"/>
           <w:strike w:val="0"/>
           <w:color w:val="000000"/>
@@ -3304,6 +3043,7 @@
       <w:r>
         <w:rPr>
           <w:i w:val="1"/>
+          <w:iCs w:val="1"/>
           <w:rtl w:val="0"/>
         </w:rPr>
         <w:t xml:space="preserve">antlr4</w:t>
@@ -3394,7 +3134,9 @@
         <w:rPr>
           <w:rFonts w:ascii="Times New Roman" w:cs="Times New Roman" w:eastAsia="Times New Roman" w:hAnsi="Times New Roman"/>
           <w:b w:val="0"/>
+          <w:bCs w:val="0"/>
           <w:i w:val="1"/>
+          <w:iCs w:val="1"/>
           <w:smallCaps w:val="0"/>
           <w:strike w:val="0"/>
           <w:color w:val="000000"/>
@@ -3409,7 +3151,9 @@
         <w:rPr>
           <w:rFonts w:ascii="Times New Roman" w:cs="Times New Roman" w:eastAsia="Times New Roman" w:hAnsi="Times New Roman"/>
           <w:b w:val="0"/>
+          <w:bCs w:val="0"/>
           <w:i w:val="1"/>
+          <w:iCs w:val="1"/>
           <w:smallCaps w:val="0"/>
           <w:strike w:val="0"/>
           <w:color w:val="000000"/>
@@ -3425,6 +3169,7 @@
       <w:r>
         <w:rPr>
           <w:i w:val="1"/>
+          <w:iCs w:val="1"/>
           <w:rtl w:val="0"/>
         </w:rPr>
         <w:t xml:space="preserve">antlr4</w:t>
@@ -3447,12 +3192,12 @@
           <wp:inline distB="114300" distT="114300" distL="114300" distR="114300">
             <wp:extent cx="4211475" cy="3631634"/>
             <wp:effectExtent b="0" l="0" r="0" t="0"/>
-            <wp:docPr id="9" name="image11.png"/>
+            <wp:docPr id="9" name="image9.png"/>
             <a:graphic>
               <a:graphicData uri="http://schemas.openxmlformats.org/drawingml/2006/picture">
                 <pic:pic>
                   <pic:nvPicPr>
-                    <pic:cNvPr id="0" name="image11.png"/>
+                    <pic:cNvPr id="0" name="image9.png"/>
                     <pic:cNvPicPr preferRelativeResize="0"/>
                   </pic:nvPicPr>
                   <pic:blipFill>
@@ -3519,7 +3264,9 @@
         <w:rPr>
           <w:rFonts w:ascii="Times New Roman" w:cs="Times New Roman" w:eastAsia="Times New Roman" w:hAnsi="Times New Roman"/>
           <w:b w:val="0"/>
+          <w:bCs w:val="0"/>
           <w:i w:val="1"/>
+          <w:iCs w:val="1"/>
           <w:smallCaps w:val="0"/>
           <w:strike w:val="0"/>
           <w:color w:val="000000"/>
@@ -3534,7 +3281,9 @@
         <w:rPr>
           <w:rFonts w:ascii="Times New Roman" w:cs="Times New Roman" w:eastAsia="Times New Roman" w:hAnsi="Times New Roman"/>
           <w:b w:val="0"/>
+          <w:bCs w:val="0"/>
           <w:i w:val="1"/>
+          <w:iCs w:val="1"/>
           <w:smallCaps w:val="0"/>
           <w:strike w:val="0"/>
           <w:color w:val="000000"/>
@@ -3550,6 +3299,7 @@
       <w:r>
         <w:rPr>
           <w:i w:val="1"/>
+          <w:iCs w:val="1"/>
           <w:rtl w:val="0"/>
         </w:rPr>
         <w:t xml:space="preserve">4</w:t>
@@ -3558,7 +3308,9 @@
         <w:rPr>
           <w:rFonts w:ascii="Times New Roman" w:cs="Times New Roman" w:eastAsia="Times New Roman" w:hAnsi="Times New Roman"/>
           <w:b w:val="0"/>
+          <w:bCs w:val="0"/>
           <w:i w:val="1"/>
+          <w:iCs w:val="1"/>
           <w:smallCaps w:val="0"/>
           <w:strike w:val="0"/>
           <w:color w:val="000000"/>
@@ -3584,12 +3336,12 @@
           <wp:inline distB="114300" distT="114300" distL="114300" distR="114300">
             <wp:extent cx="6119820" cy="1295400"/>
             <wp:effectExtent b="0" l="0" r="0" t="0"/>
-            <wp:docPr id="11" name="image2.png"/>
+            <wp:docPr id="11" name="image6.png"/>
             <a:graphic>
               <a:graphicData uri="http://schemas.openxmlformats.org/drawingml/2006/picture">
                 <pic:pic>
                   <pic:nvPicPr>
-                    <pic:cNvPr id="0" name="image2.png"/>
+                    <pic:cNvPr id="0" name="image6.png"/>
                     <pic:cNvPicPr preferRelativeResize="0"/>
                   </pic:nvPicPr>
                   <pic:blipFill>
@@ -3869,7 +3621,9 @@
         <w:rPr>
           <w:rFonts w:ascii="Times New Roman" w:cs="Times New Roman" w:eastAsia="Times New Roman" w:hAnsi="Times New Roman"/>
           <w:b w:val="0"/>
+          <w:bCs w:val="0"/>
           <w:i w:val="1"/>
+          <w:iCs w:val="1"/>
           <w:smallCaps w:val="0"/>
           <w:strike w:val="0"/>
           <w:color w:val="000000"/>
@@ -3884,7 +3638,9 @@
         <w:rPr>
           <w:rFonts w:ascii="Times New Roman" w:cs="Times New Roman" w:eastAsia="Times New Roman" w:hAnsi="Times New Roman"/>
           <w:b w:val="0"/>
+          <w:bCs w:val="0"/>
           <w:i w:val="1"/>
+          <w:iCs w:val="1"/>
           <w:smallCaps w:val="0"/>
           <w:strike w:val="0"/>
           <w:color w:val="000000"/>
@@ -3900,6 +3656,7 @@
       <w:r>
         <w:rPr>
           <w:i w:val="1"/>
+          <w:iCs w:val="1"/>
           <w:rtl w:val="0"/>
         </w:rPr>
         <w:t xml:space="preserve">5</w:t>
@@ -3908,7 +3665,9 @@
         <w:rPr>
           <w:rFonts w:ascii="Times New Roman" w:cs="Times New Roman" w:eastAsia="Times New Roman" w:hAnsi="Times New Roman"/>
           <w:b w:val="0"/>
+          <w:bCs w:val="0"/>
           <w:i w:val="1"/>
+          <w:iCs w:val="1"/>
           <w:smallCaps w:val="0"/>
           <w:strike w:val="0"/>
           <w:color w:val="000000"/>
@@ -3934,12 +3693,12 @@
           <wp:inline distB="114300" distT="114300" distL="114300" distR="114300">
             <wp:extent cx="5199698" cy="2428200"/>
             <wp:effectExtent b="0" l="0" r="0" t="0"/>
-            <wp:docPr id="6" name="image5.png"/>
+            <wp:docPr id="6" name="image1.png"/>
             <a:graphic>
               <a:graphicData uri="http://schemas.openxmlformats.org/drawingml/2006/picture">
                 <pic:pic>
                   <pic:nvPicPr>
-                    <pic:cNvPr id="0" name="image5.png"/>
+                    <pic:cNvPr id="0" name="image1.png"/>
                     <pic:cNvPicPr preferRelativeResize="0"/>
                   </pic:nvPicPr>
                   <pic:blipFill>
@@ -4298,7 +4057,9 @@
         <w:rPr>
           <w:rFonts w:ascii="Times New Roman" w:cs="Times New Roman" w:eastAsia="Times New Roman" w:hAnsi="Times New Roman"/>
           <w:b w:val="0"/>
+          <w:bCs w:val="0"/>
           <w:i w:val="1"/>
+          <w:iCs w:val="1"/>
           <w:smallCaps w:val="0"/>
           <w:strike w:val="0"/>
           <w:color w:val="000000"/>
@@ -4313,7 +4074,9 @@
         <w:rPr>
           <w:rFonts w:ascii="Times New Roman" w:cs="Times New Roman" w:eastAsia="Times New Roman" w:hAnsi="Times New Roman"/>
           <w:b w:val="0"/>
+          <w:bCs w:val="0"/>
           <w:i w:val="1"/>
+          <w:iCs w:val="1"/>
           <w:smallCaps w:val="0"/>
           <w:strike w:val="0"/>
           <w:color w:val="000000"/>
@@ -4329,6 +4092,7 @@
       <w:r>
         <w:rPr>
           <w:i w:val="1"/>
+          <w:iCs w:val="1"/>
           <w:rtl w:val="0"/>
         </w:rPr>
         <w:t xml:space="preserve">6</w:t>
@@ -4337,7 +4101,9 @@
         <w:rPr>
           <w:rFonts w:ascii="Times New Roman" w:cs="Times New Roman" w:eastAsia="Times New Roman" w:hAnsi="Times New Roman"/>
           <w:b w:val="0"/>
+          <w:bCs w:val="0"/>
           <w:i w:val="1"/>
+          <w:iCs w:val="1"/>
           <w:smallCaps w:val="0"/>
           <w:strike w:val="0"/>
           <w:color w:val="000000"/>
@@ -4363,12 +4129,12 @@
           <wp:inline distB="114300" distT="114300" distL="114300" distR="114300">
             <wp:extent cx="4656773" cy="4807234"/>
             <wp:effectExtent b="0" l="0" r="0" t="0"/>
-            <wp:docPr id="13" name="image6.png"/>
+            <wp:docPr id="13" name="image13.png"/>
             <a:graphic>
               <a:graphicData uri="http://schemas.openxmlformats.org/drawingml/2006/picture">
                 <pic:pic>
                   <pic:nvPicPr>
-                    <pic:cNvPr id="0" name="image6.png"/>
+                    <pic:cNvPr id="0" name="image13.png"/>
                     <pic:cNvPicPr preferRelativeResize="0"/>
                   </pic:nvPicPr>
                   <pic:blipFill>
@@ -4578,7 +4344,9 @@
         <w:rPr>
           <w:rFonts w:ascii="Times New Roman" w:cs="Times New Roman" w:eastAsia="Times New Roman" w:hAnsi="Times New Roman"/>
           <w:b w:val="0"/>
+          <w:bCs w:val="0"/>
           <w:i w:val="1"/>
+          <w:iCs w:val="1"/>
           <w:smallCaps w:val="0"/>
           <w:strike w:val="0"/>
           <w:color w:val="000000"/>
@@ -4594,6 +4362,7 @@
       <w:r>
         <w:rPr>
           <w:i w:val="1"/>
+          <w:iCs w:val="1"/>
           <w:rtl w:val="0"/>
         </w:rPr>
         <w:t xml:space="preserve">7</w:t>
@@ -4602,7 +4371,9 @@
         <w:rPr>
           <w:rFonts w:ascii="Times New Roman" w:cs="Times New Roman" w:eastAsia="Times New Roman" w:hAnsi="Times New Roman"/>
           <w:b w:val="0"/>
+          <w:bCs w:val="0"/>
           <w:i w:val="1"/>
+          <w:iCs w:val="1"/>
           <w:smallCaps w:val="0"/>
           <w:strike w:val="0"/>
           <w:color w:val="000000"/>
@@ -4618,6 +4389,7 @@
       <w:r>
         <w:rPr>
           <w:i w:val="1"/>
+          <w:iCs w:val="1"/>
           <w:rtl w:val="0"/>
         </w:rPr>
         <w:t xml:space="preserve">Код</w:t>
@@ -4626,7 +4398,9 @@
         <w:rPr>
           <w:rFonts w:ascii="Times New Roman" w:cs="Times New Roman" w:eastAsia="Times New Roman" w:hAnsi="Times New Roman"/>
           <w:b w:val="0"/>
+          <w:bCs w:val="0"/>
           <w:i w:val="1"/>
+          <w:iCs w:val="1"/>
           <w:smallCaps w:val="0"/>
           <w:strike w:val="0"/>
           <w:color w:val="000000"/>
@@ -4645,12 +4419,12 @@
           <wp:inline distB="114300" distT="114300" distL="114300" distR="114300">
             <wp:extent cx="5766128" cy="2182970"/>
             <wp:effectExtent b="0" l="0" r="0" t="0"/>
-            <wp:docPr id="3" name="image4.png"/>
+            <wp:docPr id="3" name="image3.png"/>
             <a:graphic>
               <a:graphicData uri="http://schemas.openxmlformats.org/drawingml/2006/picture">
                 <pic:pic>
                   <pic:nvPicPr>
-                    <pic:cNvPr id="0" name="image4.png"/>
+                    <pic:cNvPr id="0" name="image3.png"/>
                     <pic:cNvPicPr preferRelativeResize="0"/>
                   </pic:nvPicPr>
                   <pic:blipFill>
@@ -4687,7 +4461,9 @@
         <w:rPr>
           <w:rFonts w:ascii="Times New Roman" w:cs="Times New Roman" w:eastAsia="Times New Roman" w:hAnsi="Times New Roman"/>
           <w:b w:val="0"/>
+          <w:bCs w:val="0"/>
           <w:i w:val="0"/>
+          <w:iCs w:val="0"/>
           <w:smallCaps w:val="0"/>
           <w:strike w:val="0"/>
           <w:color w:val="000000"/>
@@ -4714,7 +4490,9 @@
         <w:rPr>
           <w:rFonts w:ascii="Times New Roman" w:cs="Times New Roman" w:eastAsia="Times New Roman" w:hAnsi="Times New Roman"/>
           <w:b w:val="0"/>
+          <w:bCs w:val="0"/>
           <w:i w:val="0"/>
+          <w:iCs w:val="0"/>
           <w:smallCaps w:val="0"/>
           <w:strike w:val="0"/>
           <w:color w:val="000000"/>
@@ -4759,11 +4537,13 @@
         <w:jc w:val="right"/>
         <w:rPr>
           <w:i w:val="1"/>
+          <w:iCs w:val="1"/>
         </w:rPr>
       </w:pPr>
       <w:r>
         <w:rPr>
           <w:i w:val="1"/>
+          <w:iCs w:val="1"/>
           <w:rtl w:val="0"/>
         </w:rPr>
         <w:t xml:space="preserve">Листинг 3.8. Код для создания дерева</w:t>
@@ -4836,11 +4616,13 @@
         <w:jc w:val="right"/>
         <w:rPr>
           <w:i w:val="1"/>
+          <w:iCs w:val="1"/>
         </w:rPr>
       </w:pPr>
       <w:r>
         <w:rPr>
           <w:i w:val="1"/>
+          <w:iCs w:val="1"/>
           <w:rtl w:val="0"/>
         </w:rPr>
         <w:t xml:space="preserve">Листинг 3.9. Код записи дерева в выходной файл</w:t>
@@ -4858,12 +4640,12 @@
           <wp:inline distB="114300" distT="114300" distL="114300" distR="114300">
             <wp:extent cx="6124575" cy="2964206"/>
             <wp:effectExtent b="0" l="0" r="0" t="0"/>
-            <wp:docPr id="10" name="image9.png"/>
+            <wp:docPr id="10" name="image4.png"/>
             <a:graphic>
               <a:graphicData uri="http://schemas.openxmlformats.org/drawingml/2006/picture">
                 <pic:pic>
                   <pic:nvPicPr>
-                    <pic:cNvPr id="0" name="image9.png"/>
+                    <pic:cNvPr id="0" name="image4.png"/>
                     <pic:cNvPicPr preferRelativeResize="0"/>
                   </pic:nvPicPr>
                   <pic:blipFill>
@@ -4913,11 +4695,13 @@
         <w:jc w:val="right"/>
         <w:rPr>
           <w:i w:val="1"/>
+          <w:iCs w:val="1"/>
         </w:rPr>
       </w:pPr>
       <w:r>
         <w:rPr>
           <w:i w:val="1"/>
+          <w:iCs w:val="1"/>
           <w:rtl w:val="0"/>
         </w:rPr>
         <w:t xml:space="preserve">Листинг 3.10. Код функции вывода дерева</w:t>
@@ -4935,12 +4719,12 @@
           <wp:inline distB="114300" distT="114300" distL="114300" distR="114300">
             <wp:extent cx="5485448" cy="1322308"/>
             <wp:effectExtent b="0" l="0" r="0" t="0"/>
-            <wp:docPr id="7" name="image7.png"/>
+            <wp:docPr id="7" name="image11.png"/>
             <a:graphic>
               <a:graphicData uri="http://schemas.openxmlformats.org/drawingml/2006/picture">
                 <pic:pic>
                   <pic:nvPicPr>
-                    <pic:cNvPr id="0" name="image7.png"/>
+                    <pic:cNvPr id="0" name="image11.png"/>
                     <pic:cNvPicPr preferRelativeResize="0"/>
                   </pic:nvPicPr>
                   <pic:blipFill>
@@ -4991,6 +4775,7 @@
       <w:r>
         <w:rPr>
           <w:i w:val="1"/>
+          <w:iCs w:val="1"/>
           <w:rtl w:val="0"/>
         </w:rPr>
         <w:t xml:space="preserve">Листинг 3.11. Код узла дерев</w:t>
@@ -5001,12 +4786,12 @@
           <wp:inline distB="114300" distT="114300" distL="114300" distR="114300">
             <wp:extent cx="5409456" cy="2116227"/>
             <wp:effectExtent b="0" l="0" r="0" t="0"/>
-            <wp:docPr id="4" name="image10.png"/>
+            <wp:docPr id="4" name="image2.png"/>
             <a:graphic>
               <a:graphicData uri="http://schemas.openxmlformats.org/drawingml/2006/picture">
                 <pic:pic>
                   <pic:nvPicPr>
-                    <pic:cNvPr id="0" name="image10.png"/>
+                    <pic:cNvPr id="0" name="image2.png"/>
                     <pic:cNvPicPr preferRelativeResize="0"/>
                   </pic:nvPicPr>
                   <pic:blipFill>
@@ -5044,11 +4829,13 @@
         <w:jc w:val="right"/>
         <w:rPr>
           <w:i w:val="1"/>
+          <w:iCs w:val="1"/>
         </w:rPr>
       </w:pPr>
       <w:r>
         <w:rPr>
           <w:i w:val="1"/>
+          <w:iCs w:val="1"/>
           <w:rtl w:val="0"/>
         </w:rPr>
         <w:t xml:space="preserve">Листинг 3.12. Код структуры</w:t>
@@ -5068,12 +4855,12 @@
           <wp:inline distB="114300" distT="114300" distL="114300" distR="114300">
             <wp:extent cx="5475923" cy="774975"/>
             <wp:effectExtent b="0" l="0" r="0" t="0"/>
-            <wp:docPr id="5" name="image1.png"/>
+            <wp:docPr id="5" name="image10.png"/>
             <a:graphic>
               <a:graphicData uri="http://schemas.openxmlformats.org/drawingml/2006/picture">
                 <pic:pic>
                   <pic:nvPicPr>
-                    <pic:cNvPr id="0" name="image1.png"/>
+                    <pic:cNvPr id="0" name="image10.png"/>
                     <pic:cNvPicPr preferRelativeResize="0"/>
                   </pic:nvPicPr>
                   <pic:blipFill>
@@ -5172,7 +4959,9 @@
         <w:rPr>
           <w:rFonts w:ascii="Times New Roman" w:cs="Times New Roman" w:eastAsia="Times New Roman" w:hAnsi="Times New Roman"/>
           <w:b w:val="0"/>
+          <w:bCs w:val="0"/>
           <w:i w:val="1"/>
+          <w:iCs w:val="1"/>
           <w:smallCaps w:val="0"/>
           <w:strike w:val="0"/>
           <w:color w:val="000000"/>
@@ -5187,7 +4976,9 @@
         <w:rPr>
           <w:rFonts w:ascii="Times New Roman" w:cs="Times New Roman" w:eastAsia="Times New Roman" w:hAnsi="Times New Roman"/>
           <w:b w:val="0"/>
+          <w:bCs w:val="0"/>
           <w:i w:val="1"/>
+          <w:iCs w:val="1"/>
           <w:smallCaps w:val="0"/>
           <w:strike w:val="0"/>
           <w:color w:val="000000"/>
@@ -5203,6 +4994,7 @@
       <w:r>
         <w:rPr>
           <w:i w:val="1"/>
+          <w:iCs w:val="1"/>
           <w:rtl w:val="0"/>
         </w:rPr>
         <w:t xml:space="preserve">3</w:t>
@@ -5211,7 +5003,9 @@
         <w:rPr>
           <w:rFonts w:ascii="Times New Roman" w:cs="Times New Roman" w:eastAsia="Times New Roman" w:hAnsi="Times New Roman"/>
           <w:b w:val="0"/>
+          <w:bCs w:val="0"/>
           <w:i w:val="1"/>
+          <w:iCs w:val="1"/>
           <w:smallCaps w:val="0"/>
           <w:strike w:val="0"/>
           <w:color w:val="000000"/>
@@ -7781,12 +7575,12 @@
           <wp:inline distB="114300" distT="114300" distL="114300" distR="114300">
             <wp:extent cx="6611302" cy="607828"/>
             <wp:effectExtent b="0" l="0" r="0" t="0"/>
-            <wp:docPr id="1" name="image3.png"/>
+            <wp:docPr id="1" name="image5.png"/>
             <a:graphic>
               <a:graphicData uri="http://schemas.openxmlformats.org/drawingml/2006/picture">
                 <pic:pic>
                   <pic:nvPicPr>
-                    <pic:cNvPr id="0" name="image3.png"/>
+                    <pic:cNvPr id="0" name="image5.png"/>
                     <pic:cNvPicPr preferRelativeResize="0"/>
                   </pic:nvPicPr>
                   <pic:blipFill>
@@ -7932,7 +7726,9 @@
         <w:rPr>
           <w:rFonts w:ascii="Times New Roman" w:cs="Times New Roman" w:eastAsia="Times New Roman" w:hAnsi="Times New Roman"/>
           <w:b w:val="0"/>
+          <w:bCs w:val="0"/>
           <w:i w:val="0"/>
+          <w:iCs w:val="0"/>
           <w:smallCaps w:val="0"/>
           <w:strike w:val="0"/>
           <w:color w:val="000000"/>
@@ -7947,7 +7743,9 @@
         <w:rPr>
           <w:rFonts w:ascii="Times New Roman" w:cs="Times New Roman" w:eastAsia="Times New Roman" w:hAnsi="Times New Roman"/>
           <w:b w:val="0"/>
+          <w:bCs w:val="0"/>
           <w:i w:val="0"/>
+          <w:iCs w:val="0"/>
           <w:smallCaps w:val="0"/>
           <w:strike w:val="0"/>
           <w:color w:val="000000"/>
@@ -7986,7 +7784,9 @@
         <w:rPr>
           <w:rFonts w:ascii="Times New Roman" w:cs="Times New Roman" w:eastAsia="Times New Roman" w:hAnsi="Times New Roman"/>
           <w:b w:val="0"/>
+          <w:bCs w:val="0"/>
           <w:i w:val="0"/>
+          <w:iCs w:val="0"/>
           <w:smallCaps w:val="0"/>
           <w:strike w:val="0"/>
           <w:color w:val="000000"/>
@@ -8009,7 +7809,9 @@
         <w:rPr>
           <w:rFonts w:ascii="Times New Roman" w:cs="Times New Roman" w:eastAsia="Times New Roman" w:hAnsi="Times New Roman"/>
           <w:b w:val="0"/>
+          <w:bCs w:val="0"/>
           <w:i w:val="0"/>
+          <w:iCs w:val="0"/>
           <w:smallCaps w:val="0"/>
           <w:strike w:val="0"/>
           <w:color w:val="000000"/>
@@ -8032,7 +7834,9 @@
         <w:rPr>
           <w:rFonts w:ascii="Times New Roman" w:cs="Times New Roman" w:eastAsia="Times New Roman" w:hAnsi="Times New Roman"/>
           <w:b w:val="0"/>
+          <w:bCs w:val="0"/>
           <w:i w:val="0"/>
+          <w:iCs w:val="0"/>
           <w:smallCaps w:val="0"/>
           <w:strike w:val="0"/>
           <w:color w:val="000000"/>
@@ -8120,7 +7924,9 @@
       <w:rPr>
         <w:rFonts w:ascii="Times New Roman" w:cs="Times New Roman" w:eastAsia="Times New Roman" w:hAnsi="Times New Roman"/>
         <w:b w:val="0"/>
+        <w:bCs w:val="0"/>
         <w:i w:val="0"/>
+        <w:iCs w:val="0"/>
         <w:smallCaps w:val="0"/>
         <w:strike w:val="0"/>
         <w:color w:val="000000"/>
@@ -8135,7 +7941,9 @@
       <w:rPr>
         <w:rFonts w:ascii="Times New Roman" w:cs="Times New Roman" w:eastAsia="Times New Roman" w:hAnsi="Times New Roman"/>
         <w:b w:val="0"/>
+        <w:bCs w:val="0"/>
         <w:i w:val="0"/>
+        <w:iCs w:val="0"/>
         <w:smallCaps w:val="0"/>
         <w:strike w:val="0"/>
         <w:color w:val="000000"/>
@@ -8180,7 +7988,9 @@
       <w:rPr>
         <w:rFonts w:ascii="Times New Roman" w:cs="Times New Roman" w:eastAsia="Times New Roman" w:hAnsi="Times New Roman"/>
         <w:b w:val="0"/>
+        <w:bCs w:val="0"/>
         <w:i w:val="0"/>
+        <w:iCs w:val="0"/>
         <w:smallCaps w:val="0"/>
         <w:strike w:val="0"/>
         <w:color w:val="000000"/>
@@ -8226,7 +8036,9 @@
       <w:rPr>
         <w:rFonts w:ascii="Times New Roman" w:cs="Times New Roman" w:eastAsia="Times New Roman" w:hAnsi="Times New Roman"/>
         <w:b w:val="0"/>
+        <w:bCs w:val="0"/>
         <w:i w:val="0"/>
+        <w:iCs w:val="0"/>
         <w:smallCaps w:val="0"/>
         <w:strike w:val="0"/>
         <w:color w:val="000000"/>
@@ -8267,7 +8079,9 @@
       <w:rPr>
         <w:rFonts w:ascii="Times New Roman" w:cs="Times New Roman" w:eastAsia="Times New Roman" w:hAnsi="Times New Roman"/>
         <w:b w:val="0"/>
+        <w:bCs w:val="0"/>
         <w:i w:val="0"/>
+        <w:iCs w:val="0"/>
         <w:smallCaps w:val="0"/>
         <w:strike w:val="0"/>
         <w:color w:val="000000"/>
@@ -8960,6 +8774,7 @@
     <w:rPr>
       <w:rFonts w:ascii="Times New Roman" w:cs="Times New Roman" w:eastAsia="Times New Roman" w:hAnsi="Times New Roman"/>
       <w:b w:val="1"/>
+      <w:bCs w:val="1"/>
       <w:sz w:val="36"/>
       <w:szCs w:val="36"/>
     </w:rPr>
@@ -9004,6 +8819,7 @@
     <w:rPr>
       <w:rFonts w:ascii="Calibri" w:cs="Calibri" w:eastAsia="Calibri" w:hAnsi="Calibri"/>
       <w:i w:val="1"/>
+      <w:iCs w:val="1"/>
       <w:color w:val="2f5496"/>
     </w:rPr>
   </w:style>
@@ -9019,6 +8835,7 @@
     </w:pPr>
     <w:rPr>
       <w:b w:val="1"/>
+      <w:bCs w:val="1"/>
       <w:sz w:val="22"/>
       <w:szCs w:val="22"/>
     </w:rPr>
@@ -9035,6 +8852,7 @@
     </w:pPr>
     <w:rPr>
       <w:b w:val="1"/>
+      <w:bCs w:val="1"/>
       <w:sz w:val="20"/>
       <w:szCs w:val="20"/>
     </w:rPr>
@@ -9064,6 +8882,7 @@
     <w:rPr>
       <w:rFonts w:ascii="Georgia" w:cs="Georgia" w:eastAsia="Georgia" w:hAnsi="Georgia"/>
       <w:i w:val="1"/>
+      <w:iCs w:val="1"/>
       <w:color w:val="666666"/>
       <w:sz w:val="48"/>
       <w:szCs w:val="48"/>

</xml_diff>